<commit_message>
docs/47 §7: what was built after the response, with the CI run and the load figures; ADR 0044 records the new delete grants
Co-Authored-By: Claude Opus 5.5 <noreply@anthropic.com>
Claude-Session: https://claude.ai/code/session_012HHcRrzuvMBTL2FYxXtsyv
</commit_message>
<xml_diff>
--- a/treasury-platform/docs/47-REVIEW-V9-RESPONSE.docx
+++ b/treasury-platform/docs/47-REVIEW-V9-RESPONSE.docx
@@ -634,6 +634,27 @@
             <w:rtl/>
           </w:rPr>
           <w:t xml:space="preserve">6. على الدرجة</w:t>
+        </w:r>
+      </w:hyperlink>
+    </w:p>
+    <w:p>
+      <w:pPr>
+        <w:bidi/>
+        <w:spacing w:after="50" w:before="0"/>
+        <w:ind w:left="0"/>
+      </w:pPr>
+      <w:hyperlink w:history="1" w:anchor="_sec7">
+        <w:r>
+          <w:rPr>
+            <w:rFonts w:ascii="Arial" w:cs="Arial" w:eastAsia="Arial" w:hAnsi="Arial"/>
+            <w:b/>
+            <w:bCs/>
+            <w:color w:val="1F3A5F"/>
+            <w:sz w:val="20"/>
+            <w:szCs w:val="20"/>
+            <w:rtl/>
+          </w:rPr>
+          <w:t xml:space="preserve">7. ما نُفّذ بعد الرد</w:t>
         </w:r>
       </w:hyperlink>
     </w:p>
@@ -5587,6 +5608,2484 @@
           <w:rtl/>
         </w:rPr>
         <w:t xml:space="preserve">أن تُقيَّم شريحة S2 في المكوّنات التي تخصها.</w:t>
+      </w:r>
+    </w:p>
+    <w:p>
+      <w:pPr>
+        <w:bidi/>
+        <w:spacing w:after="60" w:before="0"/>
+      </w:pPr>
+    </w:p>
+    <w:p>
+      <w:pPr>
+        <w:pStyle w:val="Heading1"/>
+        <w:bidi/>
+      </w:pPr>
+      <w:bookmarkStart w:name="_sec7" w:id="7"/>
+      <w:r>
+        <w:rPr>
+          <w:rFonts w:ascii="Arial" w:cs="Arial" w:eastAsia="Arial" w:hAnsi="Arial"/>
+          <w:b/>
+          <w:bCs/>
+          <w:color w:val="1F3A5F"/>
+          <w:sz w:val="32"/>
+          <w:szCs w:val="32"/>
+          <w:rtl/>
+        </w:rPr>
+        <w:t xml:space="preserve">7. ما نُفّذ بعد الرد</w:t>
+      </w:r>
+      <w:bookmarkEnd w:id="7"/>
+    </w:p>
+    <w:p>
+      <w:pPr>
+        <w:bidi/>
+        <w:spacing w:after="110" w:before="0" w:line="312"/>
+      </w:pPr>
+      <w:r>
+        <w:rPr>
+          <w:rFonts w:ascii="Arial" w:cs="Arial" w:eastAsia="Arial" w:hAnsi="Arial"/>
+          <w:b w:val="false"/>
+          <w:bCs w:val="false"/>
+          <w:sz w:val="21"/>
+          <w:szCs w:val="21"/>
+          <w:rtl/>
+        </w:rPr>
+        <w:t xml:space="preserve">نُفّذت بنود §4 التي لا تنتظر قرار المالك، في ثلاث إيداعات (33ab8fd، 40cfa74، fb2cf1b). وتشغيل CI الكامل بعدها ناجح: 83 اختبار تكامل و106 اختبارات وحدة، واختبار المتصفح، و«EXIT 0».</w:t>
+      </w:r>
+    </w:p>
+    <w:tbl>
+      <w:tblPr>
+        <w:bidiVisual/>
+        <w:tblW w:type="dxa" w:w="9864"/>
+        <w:tblBorders>
+          <w:top w:val="single" w:color="auto" w:sz="4"/>
+          <w:left w:val="single" w:color="auto" w:sz="4"/>
+          <w:bottom w:val="single" w:color="auto" w:sz="4"/>
+          <w:right w:val="single" w:color="auto" w:sz="4"/>
+          <w:insideH w:val="single" w:color="auto" w:sz="4"/>
+          <w:insideV w:val="single" w:color="auto" w:sz="4"/>
+        </w:tblBorders>
+      </w:tblPr>
+      <w:tblGrid>
+        <w:gridCol w:w="1920"/>
+        <w:gridCol w:w="3143"/>
+        <w:gridCol w:w="4801"/>
+      </w:tblGrid>
+      <w:tr>
+        <w:trPr>
+          <w:cantSplit/>
+          <w:tblHeader/>
+        </w:trPr>
+        <w:tc>
+          <w:tcPr>
+            <w:tcW w:type="dxa" w:w="1920"/>
+            <w:tcBorders>
+              <w:top w:val="single" w:color="BFC9D6" w:sz="4"/>
+              <w:left w:val="single" w:color="BFC9D6" w:sz="4"/>
+              <w:bottom w:val="single" w:color="BFC9D6" w:sz="4"/>
+              <w:right w:val="single" w:color="BFC9D6" w:sz="4"/>
+            </w:tcBorders>
+            <w:shd w:fill="1F3A5F" w:color="auto" w:val="clear"/>
+            <w:tcMar>
+              <w:top w:type="dxa" w:w="50"/>
+              <w:left w:type="dxa" w:w="90"/>
+              <w:bottom w:type="dxa" w:w="50"/>
+              <w:right w:type="dxa" w:w="90"/>
+            </w:tcMar>
+            <w:vAlign w:val="center"/>
+          </w:tcPr>
+          <w:p>
+            <w:pPr>
+              <w:keepNext w:val="false"/>
+              <w:bidi/>
+              <w:spacing w:after="30" w:before="30" w:line="264"/>
+            </w:pPr>
+            <w:r>
+              <w:rPr>
+                <w:rFonts w:ascii="Arial" w:cs="Arial" w:eastAsia="Arial" w:hAnsi="Arial"/>
+                <w:b/>
+                <w:bCs/>
+                <w:color w:val="FFFFFF"/>
+                <w:sz w:val="18"/>
+                <w:szCs w:val="18"/>
+                <w:rtl/>
+              </w:rPr>
+              <w:t xml:space="preserve">البند</w:t>
+            </w:r>
+          </w:p>
+        </w:tc>
+        <w:tc>
+          <w:tcPr>
+            <w:tcW w:type="dxa" w:w="3143"/>
+            <w:tcBorders>
+              <w:top w:val="single" w:color="BFC9D6" w:sz="4"/>
+              <w:left w:val="single" w:color="BFC9D6" w:sz="4"/>
+              <w:bottom w:val="single" w:color="BFC9D6" w:sz="4"/>
+              <w:right w:val="single" w:color="BFC9D6" w:sz="4"/>
+            </w:tcBorders>
+            <w:shd w:fill="1F3A5F" w:color="auto" w:val="clear"/>
+            <w:tcMar>
+              <w:top w:type="dxa" w:w="50"/>
+              <w:left w:type="dxa" w:w="90"/>
+              <w:bottom w:type="dxa" w:w="50"/>
+              <w:right w:type="dxa" w:w="90"/>
+            </w:tcMar>
+            <w:vAlign w:val="center"/>
+          </w:tcPr>
+          <w:p>
+            <w:pPr>
+              <w:keepNext w:val="false"/>
+              <w:bidi/>
+              <w:spacing w:after="30" w:before="30" w:line="264"/>
+            </w:pPr>
+            <w:r>
+              <w:rPr>
+                <w:rFonts w:ascii="Arial" w:cs="Arial" w:eastAsia="Arial" w:hAnsi="Arial"/>
+                <w:b/>
+                <w:bCs/>
+                <w:color w:val="FFFFFF"/>
+                <w:sz w:val="18"/>
+                <w:szCs w:val="18"/>
+                <w:rtl/>
+              </w:rPr>
+              <w:t xml:space="preserve">ما بُني</w:t>
+            </w:r>
+          </w:p>
+        </w:tc>
+        <w:tc>
+          <w:tcPr>
+            <w:tcW w:type="dxa" w:w="4801"/>
+            <w:tcBorders>
+              <w:top w:val="single" w:color="BFC9D6" w:sz="4"/>
+              <w:left w:val="single" w:color="BFC9D6" w:sz="4"/>
+              <w:bottom w:val="single" w:color="BFC9D6" w:sz="4"/>
+              <w:right w:val="single" w:color="BFC9D6" w:sz="4"/>
+            </w:tcBorders>
+            <w:shd w:fill="1F3A5F" w:color="auto" w:val="clear"/>
+            <w:tcMar>
+              <w:top w:type="dxa" w:w="50"/>
+              <w:left w:type="dxa" w:w="90"/>
+              <w:bottom w:type="dxa" w:w="50"/>
+              <w:right w:type="dxa" w:w="90"/>
+            </w:tcMar>
+            <w:vAlign w:val="center"/>
+          </w:tcPr>
+          <w:p>
+            <w:pPr>
+              <w:keepNext w:val="false"/>
+              <w:bidi/>
+              <w:spacing w:after="30" w:before="30" w:line="264"/>
+            </w:pPr>
+            <w:r>
+              <w:rPr>
+                <w:rFonts w:ascii="Arial" w:cs="Arial" w:eastAsia="Arial" w:hAnsi="Arial"/>
+                <w:b/>
+                <w:bCs/>
+                <w:color w:val="FFFFFF"/>
+                <w:sz w:val="18"/>
+                <w:szCs w:val="18"/>
+                <w:rtl/>
+              </w:rPr>
+              <w:t xml:space="preserve">الدليل</w:t>
+            </w:r>
+          </w:p>
+        </w:tc>
+      </w:tr>
+      <w:tr>
+        <w:trPr>
+          <w:cantSplit/>
+        </w:trPr>
+        <w:tc>
+          <w:tcPr>
+            <w:tcW w:type="dxa" w:w="1920"/>
+            <w:tcBorders>
+              <w:top w:val="single" w:color="BFC9D6" w:sz="4"/>
+              <w:left w:val="single" w:color="BFC9D6" w:sz="4"/>
+              <w:bottom w:val="single" w:color="BFC9D6" w:sz="4"/>
+              <w:right w:val="single" w:color="BFC9D6" w:sz="4"/>
+            </w:tcBorders>
+            <w:tcMar>
+              <w:top w:type="dxa" w:w="50"/>
+              <w:left w:type="dxa" w:w="90"/>
+              <w:bottom w:type="dxa" w:w="50"/>
+              <w:right w:type="dxa" w:w="90"/>
+            </w:tcMar>
+            <w:vAlign w:val="top"/>
+          </w:tcPr>
+          <w:p>
+            <w:pPr>
+              <w:keepNext w:val="false"/>
+              <w:bidi/>
+              <w:spacing w:after="30" w:before="30" w:line="264"/>
+            </w:pPr>
+            <w:r>
+              <w:rPr>
+                <w:rFonts w:ascii="Arial" w:cs="Arial" w:eastAsia="Arial" w:hAnsi="Arial"/>
+                <w:b w:val="false"/>
+                <w:bCs w:val="false"/>
+                <w:sz w:val="18"/>
+                <w:szCs w:val="18"/>
+                <w:rtl/>
+              </w:rPr>
+              <w:t xml:space="preserve">الواجهات الأربع (P0-1)</w:t>
+            </w:r>
+          </w:p>
+        </w:tc>
+        <w:tc>
+          <w:tcPr>
+            <w:tcW w:type="dxa" w:w="3143"/>
+            <w:tcBorders>
+              <w:top w:val="single" w:color="BFC9D6" w:sz="4"/>
+              <w:left w:val="single" w:color="BFC9D6" w:sz="4"/>
+              <w:bottom w:val="single" w:color="BFC9D6" w:sz="4"/>
+              <w:right w:val="single" w:color="BFC9D6" w:sz="4"/>
+            </w:tcBorders>
+            <w:tcMar>
+              <w:top w:type="dxa" w:w="50"/>
+              <w:left w:type="dxa" w:w="90"/>
+              <w:bottom w:type="dxa" w:w="50"/>
+              <w:right w:type="dxa" w:w="90"/>
+            </w:tcMar>
+            <w:vAlign w:val="top"/>
+          </w:tcPr>
+          <w:p>
+            <w:pPr>
+              <w:keepNext w:val="false"/>
+              <w:bidi/>
+              <w:spacing w:after="30" w:before="30" w:line="264"/>
+            </w:pPr>
+            <w:r>
+              <w:rPr>
+                <w:rFonts w:ascii="Arial" w:cs="Arial" w:eastAsia="Arial" w:hAnsi="Arial"/>
+                <w:b w:val="false"/>
+                <w:bCs w:val="false"/>
+                <w:sz w:val="18"/>
+                <w:szCs w:val="18"/>
+                <w:rtl/>
+              </w:rPr>
+              <w:t xml:space="preserve">واجهة برمجية وشاشة لكل منها: الكفلاء وأرقامهم المؤرّخة ومستندهم، تقرير سمة، خطوط المنتجات مع حد 100% من الإيراد وتجميدها بعد اعتماد التقييم، وقرار جهة التمويل مع تحقق مستخدم آخر</w:t>
+            </w:r>
+          </w:p>
+        </w:tc>
+        <w:tc>
+          <w:tcPr>
+            <w:tcW w:type="dxa" w:w="4801"/>
+            <w:tcBorders>
+              <w:top w:val="single" w:color="BFC9D6" w:sz="4"/>
+              <w:left w:val="single" w:color="BFC9D6" w:sz="4"/>
+              <w:bottom w:val="single" w:color="BFC9D6" w:sz="4"/>
+              <w:right w:val="single" w:color="BFC9D6" w:sz="4"/>
+            </w:tcBorders>
+            <w:tcMar>
+              <w:top w:type="dxa" w:w="50"/>
+              <w:left w:type="dxa" w:w="90"/>
+              <w:bottom w:type="dxa" w:w="50"/>
+              <w:right w:type="dxa" w:w="90"/>
+            </w:tcMar>
+            <w:vAlign w:val="top"/>
+          </w:tcPr>
+          <w:p>
+            <w:pPr>
+              <w:keepNext w:val="false"/>
+              <w:bidi/>
+              <w:spacing w:after="30" w:before="30" w:line="264"/>
+            </w:pPr>
+            <w:r>
+              <w:rPr>
+                <w:rFonts w:ascii="Courier New" w:cs="Courier New" w:eastAsia="Courier New" w:hAnsi="Courier New"/>
+                <w:b w:val="false"/>
+                <w:bCs w:val="false"/>
+                <w:color w:val="1F2937"/>
+                <w:sz w:val="16"/>
+                <w:szCs w:val="16"/>
+                <w:shd w:fill="F1F3F5" w:color="auto" w:val="clear"/>
+                <w:rtl/>
+              </w:rPr>
+              <w:t xml:space="preserve">‎CreditInputsEndpoints.cs‎</w:t>
+            </w:r>
+            <w:r>
+              <w:rPr>
+                <w:rFonts w:ascii="Arial" w:cs="Arial" w:eastAsia="Arial" w:hAnsi="Arial"/>
+                <w:b w:val="false"/>
+                <w:bCs w:val="false"/>
+                <w:sz w:val="18"/>
+                <w:szCs w:val="18"/>
+                <w:rtl/>
+              </w:rPr>
+              <w:t xml:space="preserve">، </w:t>
+            </w:r>
+            <w:r>
+              <w:rPr>
+                <w:rFonts w:ascii="Courier New" w:cs="Courier New" w:eastAsia="Courier New" w:hAnsi="Courier New"/>
+                <w:b w:val="false"/>
+                <w:bCs w:val="false"/>
+                <w:color w:val="1F2937"/>
+                <w:sz w:val="16"/>
+                <w:szCs w:val="16"/>
+                <w:shd w:fill="F1F3F5" w:color="auto" w:val="clear"/>
+                <w:rtl/>
+              </w:rPr>
+              <w:t xml:space="preserve">‎CreditInputs.tsx‎</w:t>
+            </w:r>
+            <w:r>
+              <w:rPr>
+                <w:rFonts w:ascii="Arial" w:cs="Arial" w:eastAsia="Arial" w:hAnsi="Arial"/>
+                <w:b w:val="false"/>
+                <w:bCs w:val="false"/>
+                <w:sz w:val="18"/>
+                <w:szCs w:val="18"/>
+                <w:rtl/>
+              </w:rPr>
+              <w:t xml:space="preserve">، </w:t>
+            </w:r>
+            <w:r>
+              <w:rPr>
+                <w:rFonts w:ascii="Courier New" w:cs="Courier New" w:eastAsia="Courier New" w:hAnsi="Courier New"/>
+                <w:b w:val="false"/>
+                <w:bCs w:val="false"/>
+                <w:color w:val="1F2937"/>
+                <w:sz w:val="16"/>
+                <w:szCs w:val="16"/>
+                <w:shd w:fill="F1F3F5" w:color="auto" w:val="clear"/>
+                <w:rtl/>
+              </w:rPr>
+              <w:t xml:space="preserve">‎CreditInputsTests‎</w:t>
+            </w:r>
+          </w:p>
+        </w:tc>
+      </w:tr>
+      <w:tr>
+        <w:trPr>
+          <w:cantSplit/>
+        </w:trPr>
+        <w:tc>
+          <w:tcPr>
+            <w:tcW w:type="dxa" w:w="1920"/>
+            <w:tcBorders>
+              <w:top w:val="single" w:color="BFC9D6" w:sz="4"/>
+              <w:left w:val="single" w:color="BFC9D6" w:sz="4"/>
+              <w:bottom w:val="single" w:color="BFC9D6" w:sz="4"/>
+              <w:right w:val="single" w:color="BFC9D6" w:sz="4"/>
+            </w:tcBorders>
+            <w:shd w:fill="F5F8FC" w:color="auto" w:val="clear"/>
+            <w:tcMar>
+              <w:top w:type="dxa" w:w="50"/>
+              <w:left w:type="dxa" w:w="90"/>
+              <w:bottom w:type="dxa" w:w="50"/>
+              <w:right w:type="dxa" w:w="90"/>
+            </w:tcMar>
+            <w:vAlign w:val="top"/>
+          </w:tcPr>
+          <w:p>
+            <w:pPr>
+              <w:keepNext w:val="false"/>
+              <w:bidi/>
+              <w:spacing w:after="30" w:before="30" w:line="264"/>
+            </w:pPr>
+            <w:r>
+              <w:rPr>
+                <w:rFonts w:ascii="Arial" w:cs="Arial" w:eastAsia="Arial" w:hAnsi="Arial"/>
+                <w:b w:val="false"/>
+                <w:bCs w:val="false"/>
+                <w:sz w:val="18"/>
+                <w:szCs w:val="18"/>
+                <w:rtl/>
+              </w:rPr>
+              <w:t xml:space="preserve">مسار المتصفح لـ S2-ب (P1-1)</w:t>
+            </w:r>
+          </w:p>
+        </w:tc>
+        <w:tc>
+          <w:tcPr>
+            <w:tcW w:type="dxa" w:w="3143"/>
+            <w:tcBorders>
+              <w:top w:val="single" w:color="BFC9D6" w:sz="4"/>
+              <w:left w:val="single" w:color="BFC9D6" w:sz="4"/>
+              <w:bottom w:val="single" w:color="BFC9D6" w:sz="4"/>
+              <w:right w:val="single" w:color="BFC9D6" w:sz="4"/>
+            </w:tcBorders>
+            <w:shd w:fill="F5F8FC" w:color="auto" w:val="clear"/>
+            <w:tcMar>
+              <w:top w:type="dxa" w:w="50"/>
+              <w:left w:type="dxa" w:w="90"/>
+              <w:bottom w:type="dxa" w:w="50"/>
+              <w:right w:type="dxa" w:w="90"/>
+            </w:tcMar>
+            <w:vAlign w:val="top"/>
+          </w:tcPr>
+          <w:p>
+            <w:pPr>
+              <w:keepNext w:val="false"/>
+              <w:bidi/>
+              <w:spacing w:after="30" w:before="30" w:line="264"/>
+            </w:pPr>
+            <w:r>
+              <w:rPr>
+                <w:rFonts w:ascii="Arial" w:cs="Arial" w:eastAsia="Arial" w:hAnsi="Arial"/>
+                <w:b w:val="false"/>
+                <w:bCs w:val="false"/>
+                <w:sz w:val="18"/>
+                <w:szCs w:val="18"/>
+                <w:rtl/>
+              </w:rPr>
+              <w:t xml:space="preserve">يدعو المدير محللًا ماليًا، فيقبل الدعوة ويدخل قائمة مركز مالي ويحفظها، ثم يفتح مكتبة الصيغ والتقييمات ولوحة الالتزام</w:t>
+            </w:r>
+          </w:p>
+        </w:tc>
+        <w:tc>
+          <w:tcPr>
+            <w:tcW w:type="dxa" w:w="4801"/>
+            <w:tcBorders>
+              <w:top w:val="single" w:color="BFC9D6" w:sz="4"/>
+              <w:left w:val="single" w:color="BFC9D6" w:sz="4"/>
+              <w:bottom w:val="single" w:color="BFC9D6" w:sz="4"/>
+              <w:right w:val="single" w:color="BFC9D6" w:sz="4"/>
+            </w:tcBorders>
+            <w:shd w:fill="F5F8FC" w:color="auto" w:val="clear"/>
+            <w:tcMar>
+              <w:top w:type="dxa" w:w="50"/>
+              <w:left w:type="dxa" w:w="90"/>
+              <w:bottom w:type="dxa" w:w="50"/>
+              <w:right w:type="dxa" w:w="90"/>
+            </w:tcMar>
+            <w:vAlign w:val="top"/>
+          </w:tcPr>
+          <w:p>
+            <w:pPr>
+              <w:keepNext w:val="false"/>
+              <w:bidi/>
+              <w:spacing w:after="30" w:before="30" w:line="264"/>
+            </w:pPr>
+            <w:r>
+              <w:rPr>
+                <w:rFonts w:ascii="Courier New" w:cs="Courier New" w:eastAsia="Courier New" w:hAnsi="Courier New"/>
+                <w:b w:val="false"/>
+                <w:bCs w:val="false"/>
+                <w:color w:val="1F2937"/>
+                <w:sz w:val="16"/>
+                <w:szCs w:val="16"/>
+                <w:shd w:fill="F1F3F5" w:color="auto" w:val="clear"/>
+                <w:rtl/>
+              </w:rPr>
+              <w:t xml:space="preserve">‎app/web/e2e/s0.spec.ts‎</w:t>
+            </w:r>
+          </w:p>
+        </w:tc>
+      </w:tr>
+      <w:tr>
+        <w:trPr>
+          <w:cantSplit/>
+        </w:trPr>
+        <w:tc>
+          <w:tcPr>
+            <w:tcW w:type="dxa" w:w="1920"/>
+            <w:tcBorders>
+              <w:top w:val="single" w:color="BFC9D6" w:sz="4"/>
+              <w:left w:val="single" w:color="BFC9D6" w:sz="4"/>
+              <w:bottom w:val="single" w:color="BFC9D6" w:sz="4"/>
+              <w:right w:val="single" w:color="BFC9D6" w:sz="4"/>
+            </w:tcBorders>
+            <w:tcMar>
+              <w:top w:type="dxa" w:w="50"/>
+              <w:left w:type="dxa" w:w="90"/>
+              <w:bottom w:type="dxa" w:w="50"/>
+              <w:right w:type="dxa" w:w="90"/>
+            </w:tcMar>
+            <w:vAlign w:val="top"/>
+          </w:tcPr>
+          <w:p>
+            <w:pPr>
+              <w:keepNext w:val="false"/>
+              <w:bidi/>
+              <w:spacing w:after="30" w:before="30" w:line="264"/>
+            </w:pPr>
+            <w:r>
+              <w:rPr>
+                <w:rFonts w:ascii="Arial" w:cs="Arial" w:eastAsia="Arial" w:hAnsi="Arial"/>
+                <w:b w:val="false"/>
+                <w:bCs w:val="false"/>
+                <w:sz w:val="18"/>
+                <w:szCs w:val="18"/>
+                <w:rtl/>
+              </w:rPr>
+              <w:t xml:space="preserve">الحمل على HTTP (P1-2)</w:t>
+            </w:r>
+          </w:p>
+        </w:tc>
+        <w:tc>
+          <w:tcPr>
+            <w:tcW w:type="dxa" w:w="3143"/>
+            <w:tcBorders>
+              <w:top w:val="single" w:color="BFC9D6" w:sz="4"/>
+              <w:left w:val="single" w:color="BFC9D6" w:sz="4"/>
+              <w:bottom w:val="single" w:color="BFC9D6" w:sz="4"/>
+              <w:right w:val="single" w:color="BFC9D6" w:sz="4"/>
+            </w:tcBorders>
+            <w:tcMar>
+              <w:top w:type="dxa" w:w="50"/>
+              <w:left w:type="dxa" w:w="90"/>
+              <w:bottom w:type="dxa" w:w="50"/>
+              <w:right w:type="dxa" w:w="90"/>
+            </w:tcMar>
+            <w:vAlign w:val="top"/>
+          </w:tcPr>
+          <w:p>
+            <w:pPr>
+              <w:keepNext w:val="false"/>
+              <w:bidi/>
+              <w:spacing w:after="30" w:before="30" w:line="264"/>
+            </w:pPr>
+            <w:r>
+              <w:rPr>
+                <w:rFonts w:ascii="Arial" w:cs="Arial" w:eastAsia="Arial" w:hAnsi="Arial"/>
+                <w:b w:val="false"/>
+                <w:bCs w:val="false"/>
+                <w:sz w:val="18"/>
+                <w:szCs w:val="18"/>
+                <w:rtl/>
+              </w:rPr>
+              <w:t xml:space="preserve">عشرون عميلًا، لكل منهم جلسته، يرسلون 400 طلب على ثمانية مسارات رئيسية</w:t>
+            </w:r>
+          </w:p>
+        </w:tc>
+        <w:tc>
+          <w:tcPr>
+            <w:tcW w:type="dxa" w:w="4801"/>
+            <w:tcBorders>
+              <w:top w:val="single" w:color="BFC9D6" w:sz="4"/>
+              <w:left w:val="single" w:color="BFC9D6" w:sz="4"/>
+              <w:bottom w:val="single" w:color="BFC9D6" w:sz="4"/>
+              <w:right w:val="single" w:color="BFC9D6" w:sz="4"/>
+            </w:tcBorders>
+            <w:tcMar>
+              <w:top w:type="dxa" w:w="50"/>
+              <w:left w:type="dxa" w:w="90"/>
+              <w:bottom w:type="dxa" w:w="50"/>
+              <w:right w:type="dxa" w:w="90"/>
+            </w:tcMar>
+            <w:vAlign w:val="top"/>
+          </w:tcPr>
+          <w:p>
+            <w:pPr>
+              <w:keepNext w:val="false"/>
+              <w:bidi/>
+              <w:spacing w:after="30" w:before="30" w:line="264"/>
+            </w:pPr>
+            <w:r>
+              <w:rPr>
+                <w:rFonts w:ascii="Courier New" w:cs="Courier New" w:eastAsia="Courier New" w:hAnsi="Courier New"/>
+                <w:b w:val="false"/>
+                <w:bCs w:val="false"/>
+                <w:color w:val="1F2937"/>
+                <w:sz w:val="16"/>
+                <w:szCs w:val="16"/>
+                <w:shd w:fill="F1F3F5" w:color="auto" w:val="clear"/>
+                <w:rtl/>
+              </w:rPr>
+              <w:t xml:space="preserve">‎HttpLoadTests‎</w:t>
+            </w:r>
+          </w:p>
+        </w:tc>
+      </w:tr>
+      <w:tr>
+        <w:trPr>
+          <w:cantSplit/>
+        </w:trPr>
+        <w:tc>
+          <w:tcPr>
+            <w:tcW w:type="dxa" w:w="1920"/>
+            <w:tcBorders>
+              <w:top w:val="single" w:color="BFC9D6" w:sz="4"/>
+              <w:left w:val="single" w:color="BFC9D6" w:sz="4"/>
+              <w:bottom w:val="single" w:color="BFC9D6" w:sz="4"/>
+              <w:right w:val="single" w:color="BFC9D6" w:sz="4"/>
+            </w:tcBorders>
+            <w:shd w:fill="F5F8FC" w:color="auto" w:val="clear"/>
+            <w:tcMar>
+              <w:top w:type="dxa" w:w="50"/>
+              <w:left w:type="dxa" w:w="90"/>
+              <w:bottom w:type="dxa" w:w="50"/>
+              <w:right w:type="dxa" w:w="90"/>
+            </w:tcMar>
+            <w:vAlign w:val="top"/>
+          </w:tcPr>
+          <w:p>
+            <w:pPr>
+              <w:keepNext w:val="false"/>
+              <w:bidi/>
+              <w:spacing w:after="30" w:before="30" w:line="264"/>
+            </w:pPr>
+            <w:r>
+              <w:rPr>
+                <w:rFonts w:ascii="Arial" w:cs="Arial" w:eastAsia="Arial" w:hAnsi="Arial"/>
+                <w:b w:val="false"/>
+                <w:bCs w:val="false"/>
+                <w:sz w:val="18"/>
+                <w:szCs w:val="18"/>
+                <w:rtl/>
+              </w:rPr>
+              <w:t xml:space="preserve">تخفيف 044 بلا اختبار (§5 بند 1)</w:t>
+            </w:r>
+          </w:p>
+        </w:tc>
+        <w:tc>
+          <w:tcPr>
+            <w:tcW w:type="dxa" w:w="3143"/>
+            <w:tcBorders>
+              <w:top w:val="single" w:color="BFC9D6" w:sz="4"/>
+              <w:left w:val="single" w:color="BFC9D6" w:sz="4"/>
+              <w:bottom w:val="single" w:color="BFC9D6" w:sz="4"/>
+              <w:right w:val="single" w:color="BFC9D6" w:sz="4"/>
+            </w:tcBorders>
+            <w:shd w:fill="F5F8FC" w:color="auto" w:val="clear"/>
+            <w:tcMar>
+              <w:top w:type="dxa" w:w="50"/>
+              <w:left w:type="dxa" w:w="90"/>
+              <w:bottom w:type="dxa" w:w="50"/>
+              <w:right w:type="dxa" w:w="90"/>
+            </w:tcMar>
+            <w:vAlign w:val="top"/>
+          </w:tcPr>
+          <w:p>
+            <w:pPr>
+              <w:keepNext w:val="false"/>
+              <w:bidi/>
+              <w:spacing w:after="30" w:before="30" w:line="264"/>
+            </w:pPr>
+            <w:r>
+              <w:rPr>
+                <w:rFonts w:ascii="Arial" w:cs="Arial" w:eastAsia="Arial" w:hAnsi="Arial"/>
+                <w:b w:val="false"/>
+                <w:bCs w:val="false"/>
+                <w:sz w:val="18"/>
+                <w:szCs w:val="18"/>
+                <w:rtl/>
+              </w:rPr>
+              <w:t xml:space="preserve">اختبار يمر بلقطة تسمّي تقدير إيراد معتمدًا بلا قائمة</w:t>
+            </w:r>
+          </w:p>
+        </w:tc>
+        <w:tc>
+          <w:tcPr>
+            <w:tcW w:type="dxa" w:w="4801"/>
+            <w:tcBorders>
+              <w:top w:val="single" w:color="BFC9D6" w:sz="4"/>
+              <w:left w:val="single" w:color="BFC9D6" w:sz="4"/>
+              <w:bottom w:val="single" w:color="BFC9D6" w:sz="4"/>
+              <w:right w:val="single" w:color="BFC9D6" w:sz="4"/>
+            </w:tcBorders>
+            <w:shd w:fill="F5F8FC" w:color="auto" w:val="clear"/>
+            <w:tcMar>
+              <w:top w:type="dxa" w:w="50"/>
+              <w:left w:type="dxa" w:w="90"/>
+              <w:bottom w:type="dxa" w:w="50"/>
+              <w:right w:type="dxa" w:w="90"/>
+            </w:tcMar>
+            <w:vAlign w:val="top"/>
+          </w:tcPr>
+          <w:p>
+            <w:pPr>
+              <w:keepNext w:val="false"/>
+              <w:bidi/>
+              <w:spacing w:after="30" w:before="30" w:line="264"/>
+            </w:pPr>
+            <w:r>
+              <w:rPr>
+                <w:rFonts w:ascii="Courier New" w:cs="Courier New" w:eastAsia="Courier New" w:hAnsi="Courier New"/>
+                <w:b w:val="false"/>
+                <w:bCs w:val="false"/>
+                <w:color w:val="1F2937"/>
+                <w:sz w:val="16"/>
+                <w:szCs w:val="16"/>
+                <w:shd w:fill="F1F3F5" w:color="auto" w:val="clear"/>
+                <w:rtl/>
+              </w:rPr>
+              <w:t xml:space="preserve">‎AcFac7Tests‎</w:t>
+            </w:r>
+          </w:p>
+        </w:tc>
+      </w:tr>
+      <w:tr>
+        <w:trPr>
+          <w:cantSplit/>
+        </w:trPr>
+        <w:tc>
+          <w:tcPr>
+            <w:tcW w:type="dxa" w:w="1920"/>
+            <w:tcBorders>
+              <w:top w:val="single" w:color="BFC9D6" w:sz="4"/>
+              <w:left w:val="single" w:color="BFC9D6" w:sz="4"/>
+              <w:bottom w:val="single" w:color="BFC9D6" w:sz="4"/>
+              <w:right w:val="single" w:color="BFC9D6" w:sz="4"/>
+            </w:tcBorders>
+            <w:tcMar>
+              <w:top w:type="dxa" w:w="50"/>
+              <w:left w:type="dxa" w:w="90"/>
+              <w:bottom w:type="dxa" w:w="50"/>
+              <w:right w:type="dxa" w:w="90"/>
+            </w:tcMar>
+            <w:vAlign w:val="top"/>
+          </w:tcPr>
+          <w:p>
+            <w:pPr>
+              <w:keepNext w:val="false"/>
+              <w:bidi/>
+              <w:spacing w:after="30" w:before="30" w:line="264"/>
+            </w:pPr>
+            <w:r>
+              <w:rPr>
+                <w:rFonts w:ascii="Courier New" w:cs="Courier New" w:eastAsia="Courier New" w:hAnsi="Courier New"/>
+                <w:b w:val="false"/>
+                <w:bCs w:val="false"/>
+                <w:color w:val="1F2937"/>
+                <w:sz w:val="16"/>
+                <w:szCs w:val="16"/>
+                <w:shd w:fill="F1F3F5" w:color="auto" w:val="clear"/>
+                <w:rtl/>
+              </w:rPr>
+              <w:t xml:space="preserve">‎docs/31:73‎</w:t>
+            </w:r>
+            <w:r>
+              <w:rPr>
+                <w:rFonts w:ascii="Arial" w:cs="Arial" w:eastAsia="Arial" w:hAnsi="Arial"/>
+                <w:b w:val="false"/>
+                <w:bCs w:val="false"/>
+                <w:sz w:val="18"/>
+                <w:szCs w:val="18"/>
+                <w:rtl/>
+              </w:rPr>
+              <w:t xml:space="preserve"> (P1-4)</w:t>
+            </w:r>
+          </w:p>
+        </w:tc>
+        <w:tc>
+          <w:tcPr>
+            <w:tcW w:type="dxa" w:w="3143"/>
+            <w:tcBorders>
+              <w:top w:val="single" w:color="BFC9D6" w:sz="4"/>
+              <w:left w:val="single" w:color="BFC9D6" w:sz="4"/>
+              <w:bottom w:val="single" w:color="BFC9D6" w:sz="4"/>
+              <w:right w:val="single" w:color="BFC9D6" w:sz="4"/>
+            </w:tcBorders>
+            <w:tcMar>
+              <w:top w:type="dxa" w:w="50"/>
+              <w:left w:type="dxa" w:w="90"/>
+              <w:bottom w:type="dxa" w:w="50"/>
+              <w:right w:type="dxa" w:w="90"/>
+            </w:tcMar>
+            <w:vAlign w:val="top"/>
+          </w:tcPr>
+          <w:p>
+            <w:pPr>
+              <w:keepNext w:val="false"/>
+              <w:bidi/>
+              <w:spacing w:after="30" w:before="30" w:line="264"/>
+            </w:pPr>
+            <w:r>
+              <w:rPr>
+                <w:rFonts w:ascii="Arial" w:cs="Arial" w:eastAsia="Arial" w:hAnsi="Arial"/>
+                <w:b w:val="false"/>
+                <w:bCs w:val="false"/>
+                <w:sz w:val="18"/>
+                <w:szCs w:val="18"/>
+                <w:rtl/>
+              </w:rPr>
+              <w:t xml:space="preserve">حُذفت الافتراضات الأربعة المعتمدة من قائمة المعلّق</w:t>
+            </w:r>
+          </w:p>
+        </w:tc>
+        <w:tc>
+          <w:tcPr>
+            <w:tcW w:type="dxa" w:w="4801"/>
+            <w:tcBorders>
+              <w:top w:val="single" w:color="BFC9D6" w:sz="4"/>
+              <w:left w:val="single" w:color="BFC9D6" w:sz="4"/>
+              <w:bottom w:val="single" w:color="BFC9D6" w:sz="4"/>
+              <w:right w:val="single" w:color="BFC9D6" w:sz="4"/>
+            </w:tcBorders>
+            <w:tcMar>
+              <w:top w:type="dxa" w:w="50"/>
+              <w:left w:type="dxa" w:w="90"/>
+              <w:bottom w:type="dxa" w:w="50"/>
+              <w:right w:type="dxa" w:w="90"/>
+            </w:tcMar>
+            <w:vAlign w:val="top"/>
+          </w:tcPr>
+          <w:p>
+            <w:pPr>
+              <w:keepNext w:val="false"/>
+              <w:bidi/>
+              <w:spacing w:after="30" w:before="30" w:line="264"/>
+            </w:pPr>
+            <w:r>
+              <w:rPr>
+                <w:rFonts w:ascii="Courier New" w:cs="Courier New" w:eastAsia="Courier New" w:hAnsi="Courier New"/>
+                <w:b w:val="false"/>
+                <w:bCs w:val="false"/>
+                <w:color w:val="1F2937"/>
+                <w:sz w:val="16"/>
+                <w:szCs w:val="16"/>
+                <w:shd w:fill="F1F3F5" w:color="auto" w:val="clear"/>
+                <w:rtl/>
+              </w:rPr>
+              <w:t xml:space="preserve">‎docs/31‎</w:t>
+            </w:r>
+            <w:r>
+              <w:rPr>
+                <w:rFonts w:ascii="Arial" w:cs="Arial" w:eastAsia="Arial" w:hAnsi="Arial"/>
+                <w:b w:val="false"/>
+                <w:bCs w:val="false"/>
+                <w:sz w:val="18"/>
+                <w:szCs w:val="18"/>
+                <w:rtl/>
+              </w:rPr>
+              <w:t xml:space="preserve"> السطر 73</w:t>
+            </w:r>
+          </w:p>
+        </w:tc>
+      </w:tr>
+    </w:tbl>
+    <w:p>
+      <w:pPr>
+        <w:bidi/>
+        <w:spacing w:after="120" w:before="0"/>
+      </w:pPr>
+    </w:p>
+    <w:p>
+      <w:pPr>
+        <w:bidi/>
+        <w:spacing w:after="110" w:before="0" w:line="312"/>
+      </w:pPr>
+      <w:r>
+        <w:rPr>
+          <w:rFonts w:ascii="Arial" w:cs="Arial" w:eastAsia="Arial" w:hAnsi="Arial"/>
+          <w:b w:val="false"/>
+          <w:bCs w:val="false"/>
+          <w:sz w:val="21"/>
+          <w:szCs w:val="21"/>
+          <w:rtl/>
+        </w:rPr>
+        <w:t xml:space="preserve">أرقام الحمل من تشغيل CI (400 طلب في 4.9 ثانية، الخادم المضمّن في الاختبار على القاعدة المحلية، لا شبكة إنتاج):</w:t>
+      </w:r>
+    </w:p>
+    <w:tbl>
+      <w:tblPr>
+        <w:bidiVisual/>
+        <w:tblW w:type="dxa" w:w="9864"/>
+        <w:tblBorders>
+          <w:top w:val="single" w:color="auto" w:sz="4"/>
+          <w:left w:val="single" w:color="auto" w:sz="4"/>
+          <w:bottom w:val="single" w:color="auto" w:sz="4"/>
+          <w:right w:val="single" w:color="auto" w:sz="4"/>
+          <w:insideH w:val="single" w:color="auto" w:sz="4"/>
+          <w:insideV w:val="single" w:color="auto" w:sz="4"/>
+        </w:tblBorders>
+      </w:tblPr>
+      <w:tblGrid>
+        <w:gridCol w:w="6568"/>
+        <w:gridCol w:w="966"/>
+        <w:gridCol w:w="1059"/>
+        <w:gridCol w:w="1271"/>
+      </w:tblGrid>
+      <w:tr>
+        <w:trPr>
+          <w:cantSplit/>
+          <w:tblHeader/>
+        </w:trPr>
+        <w:tc>
+          <w:tcPr>
+            <w:tcW w:type="dxa" w:w="6568"/>
+            <w:tcBorders>
+              <w:top w:val="single" w:color="BFC9D6" w:sz="4"/>
+              <w:left w:val="single" w:color="BFC9D6" w:sz="4"/>
+              <w:bottom w:val="single" w:color="BFC9D6" w:sz="4"/>
+              <w:right w:val="single" w:color="BFC9D6" w:sz="4"/>
+            </w:tcBorders>
+            <w:shd w:fill="1F3A5F" w:color="auto" w:val="clear"/>
+            <w:tcMar>
+              <w:top w:type="dxa" w:w="50"/>
+              <w:left w:type="dxa" w:w="90"/>
+              <w:bottom w:type="dxa" w:w="50"/>
+              <w:right w:type="dxa" w:w="90"/>
+            </w:tcMar>
+            <w:vAlign w:val="center"/>
+          </w:tcPr>
+          <w:p>
+            <w:pPr>
+              <w:keepNext w:val="false"/>
+              <w:bidi/>
+              <w:spacing w:after="30" w:before="30" w:line="264"/>
+            </w:pPr>
+            <w:r>
+              <w:rPr>
+                <w:rFonts w:ascii="Arial" w:cs="Arial" w:eastAsia="Arial" w:hAnsi="Arial"/>
+                <w:b/>
+                <w:bCs/>
+                <w:color w:val="FFFFFF"/>
+                <w:sz w:val="18"/>
+                <w:szCs w:val="18"/>
+                <w:rtl/>
+              </w:rPr>
+              <w:t xml:space="preserve">المسار</w:t>
+            </w:r>
+          </w:p>
+        </w:tc>
+        <w:tc>
+          <w:tcPr>
+            <w:tcW w:type="dxa" w:w="966"/>
+            <w:tcBorders>
+              <w:top w:val="single" w:color="BFC9D6" w:sz="4"/>
+              <w:left w:val="single" w:color="BFC9D6" w:sz="4"/>
+              <w:bottom w:val="single" w:color="BFC9D6" w:sz="4"/>
+              <w:right w:val="single" w:color="BFC9D6" w:sz="4"/>
+            </w:tcBorders>
+            <w:shd w:fill="1F3A5F" w:color="auto" w:val="clear"/>
+            <w:tcMar>
+              <w:top w:type="dxa" w:w="50"/>
+              <w:left w:type="dxa" w:w="90"/>
+              <w:bottom w:type="dxa" w:w="50"/>
+              <w:right w:type="dxa" w:w="90"/>
+            </w:tcMar>
+            <w:vAlign w:val="center"/>
+          </w:tcPr>
+          <w:p>
+            <w:pPr>
+              <w:keepNext w:val="false"/>
+              <w:bidi/>
+              <w:spacing w:after="30" w:before="30" w:line="264"/>
+            </w:pPr>
+            <w:r>
+              <w:rPr>
+                <w:rFonts w:ascii="Arial" w:cs="Arial" w:eastAsia="Arial" w:hAnsi="Arial"/>
+                <w:b/>
+                <w:bCs/>
+                <w:color w:val="FFFFFF"/>
+                <w:sz w:val="18"/>
+                <w:szCs w:val="18"/>
+                <w:rtl/>
+              </w:rPr>
+              <w:t xml:space="preserve">p50</w:t>
+            </w:r>
+          </w:p>
+        </w:tc>
+        <w:tc>
+          <w:tcPr>
+            <w:tcW w:type="dxa" w:w="1059"/>
+            <w:tcBorders>
+              <w:top w:val="single" w:color="BFC9D6" w:sz="4"/>
+              <w:left w:val="single" w:color="BFC9D6" w:sz="4"/>
+              <w:bottom w:val="single" w:color="BFC9D6" w:sz="4"/>
+              <w:right w:val="single" w:color="BFC9D6" w:sz="4"/>
+            </w:tcBorders>
+            <w:shd w:fill="1F3A5F" w:color="auto" w:val="clear"/>
+            <w:tcMar>
+              <w:top w:type="dxa" w:w="50"/>
+              <w:left w:type="dxa" w:w="90"/>
+              <w:bottom w:type="dxa" w:w="50"/>
+              <w:right w:type="dxa" w:w="90"/>
+            </w:tcMar>
+            <w:vAlign w:val="center"/>
+          </w:tcPr>
+          <w:p>
+            <w:pPr>
+              <w:keepNext w:val="false"/>
+              <w:bidi/>
+              <w:spacing w:after="30" w:before="30" w:line="264"/>
+            </w:pPr>
+            <w:r>
+              <w:rPr>
+                <w:rFonts w:ascii="Arial" w:cs="Arial" w:eastAsia="Arial" w:hAnsi="Arial"/>
+                <w:b/>
+                <w:bCs/>
+                <w:color w:val="FFFFFF"/>
+                <w:sz w:val="18"/>
+                <w:szCs w:val="18"/>
+                <w:rtl/>
+              </w:rPr>
+              <w:t xml:space="preserve">p95</w:t>
+            </w:r>
+          </w:p>
+        </w:tc>
+        <w:tc>
+          <w:tcPr>
+            <w:tcW w:type="dxa" w:w="1271"/>
+            <w:tcBorders>
+              <w:top w:val="single" w:color="BFC9D6" w:sz="4"/>
+              <w:left w:val="single" w:color="BFC9D6" w:sz="4"/>
+              <w:bottom w:val="single" w:color="BFC9D6" w:sz="4"/>
+              <w:right w:val="single" w:color="BFC9D6" w:sz="4"/>
+            </w:tcBorders>
+            <w:shd w:fill="1F3A5F" w:color="auto" w:val="clear"/>
+            <w:tcMar>
+              <w:top w:type="dxa" w:w="50"/>
+              <w:left w:type="dxa" w:w="90"/>
+              <w:bottom w:type="dxa" w:w="50"/>
+              <w:right w:type="dxa" w:w="90"/>
+            </w:tcMar>
+            <w:vAlign w:val="center"/>
+          </w:tcPr>
+          <w:p>
+            <w:pPr>
+              <w:keepNext w:val="false"/>
+              <w:bidi/>
+              <w:spacing w:after="30" w:before="30" w:line="264"/>
+            </w:pPr>
+            <w:r>
+              <w:rPr>
+                <w:rFonts w:ascii="Arial" w:cs="Arial" w:eastAsia="Arial" w:hAnsi="Arial"/>
+                <w:b/>
+                <w:bCs/>
+                <w:color w:val="FFFFFF"/>
+                <w:sz w:val="18"/>
+                <w:szCs w:val="18"/>
+                <w:rtl/>
+              </w:rPr>
+              <w:t xml:space="preserve">الأقصى</w:t>
+            </w:r>
+          </w:p>
+        </w:tc>
+      </w:tr>
+      <w:tr>
+        <w:trPr>
+          <w:cantSplit/>
+        </w:trPr>
+        <w:tc>
+          <w:tcPr>
+            <w:tcW w:type="dxa" w:w="6568"/>
+            <w:tcBorders>
+              <w:top w:val="single" w:color="BFC9D6" w:sz="4"/>
+              <w:left w:val="single" w:color="BFC9D6" w:sz="4"/>
+              <w:bottom w:val="single" w:color="BFC9D6" w:sz="4"/>
+              <w:right w:val="single" w:color="BFC9D6" w:sz="4"/>
+            </w:tcBorders>
+            <w:tcMar>
+              <w:top w:type="dxa" w:w="50"/>
+              <w:left w:type="dxa" w:w="90"/>
+              <w:bottom w:type="dxa" w:w="50"/>
+              <w:right w:type="dxa" w:w="90"/>
+            </w:tcMar>
+            <w:vAlign w:val="top"/>
+          </w:tcPr>
+          <w:p>
+            <w:pPr>
+              <w:keepNext w:val="false"/>
+              <w:bidi/>
+              <w:spacing w:after="30" w:before="30" w:line="264"/>
+            </w:pPr>
+            <w:r>
+              <w:rPr>
+                <w:rFonts w:ascii="Courier New" w:cs="Courier New" w:eastAsia="Courier New" w:hAnsi="Courier New"/>
+                <w:b w:val="false"/>
+                <w:bCs w:val="false"/>
+                <w:color w:val="1F2937"/>
+                <w:sz w:val="16"/>
+                <w:szCs w:val="16"/>
+                <w:shd w:fill="F1F3F5" w:color="auto" w:val="clear"/>
+                <w:rtl/>
+              </w:rPr>
+              <w:t xml:space="preserve">‎/facilities/{id}‎</w:t>
+            </w:r>
+          </w:p>
+        </w:tc>
+        <w:tc>
+          <w:tcPr>
+            <w:tcW w:type="dxa" w:w="966"/>
+            <w:tcBorders>
+              <w:top w:val="single" w:color="BFC9D6" w:sz="4"/>
+              <w:left w:val="single" w:color="BFC9D6" w:sz="4"/>
+              <w:bottom w:val="single" w:color="BFC9D6" w:sz="4"/>
+              <w:right w:val="single" w:color="BFC9D6" w:sz="4"/>
+            </w:tcBorders>
+            <w:tcMar>
+              <w:top w:type="dxa" w:w="50"/>
+              <w:left w:type="dxa" w:w="90"/>
+              <w:bottom w:type="dxa" w:w="50"/>
+              <w:right w:type="dxa" w:w="90"/>
+            </w:tcMar>
+            <w:vAlign w:val="top"/>
+          </w:tcPr>
+          <w:p>
+            <w:pPr>
+              <w:keepNext w:val="false"/>
+              <w:bidi/>
+              <w:spacing w:after="30" w:before="30" w:line="264"/>
+            </w:pPr>
+            <w:r>
+              <w:rPr>
+                <w:rFonts w:ascii="Arial" w:cs="Arial" w:eastAsia="Arial" w:hAnsi="Arial"/>
+                <w:b w:val="false"/>
+                <w:bCs w:val="false"/>
+                <w:sz w:val="18"/>
+                <w:szCs w:val="18"/>
+                <w:rtl/>
+              </w:rPr>
+              <w:t xml:space="preserve">116 ms</w:t>
+            </w:r>
+          </w:p>
+        </w:tc>
+        <w:tc>
+          <w:tcPr>
+            <w:tcW w:type="dxa" w:w="1059"/>
+            <w:tcBorders>
+              <w:top w:val="single" w:color="BFC9D6" w:sz="4"/>
+              <w:left w:val="single" w:color="BFC9D6" w:sz="4"/>
+              <w:bottom w:val="single" w:color="BFC9D6" w:sz="4"/>
+              <w:right w:val="single" w:color="BFC9D6" w:sz="4"/>
+            </w:tcBorders>
+            <w:tcMar>
+              <w:top w:type="dxa" w:w="50"/>
+              <w:left w:type="dxa" w:w="90"/>
+              <w:bottom w:type="dxa" w:w="50"/>
+              <w:right w:type="dxa" w:w="90"/>
+            </w:tcMar>
+            <w:vAlign w:val="top"/>
+          </w:tcPr>
+          <w:p>
+            <w:pPr>
+              <w:keepNext w:val="false"/>
+              <w:bidi/>
+              <w:spacing w:after="30" w:before="30" w:line="264"/>
+            </w:pPr>
+            <w:r>
+              <w:rPr>
+                <w:rFonts w:ascii="Arial" w:cs="Arial" w:eastAsia="Arial" w:hAnsi="Arial"/>
+                <w:b w:val="false"/>
+                <w:bCs w:val="false"/>
+                <w:sz w:val="18"/>
+                <w:szCs w:val="18"/>
+                <w:rtl/>
+              </w:rPr>
+              <w:t xml:space="preserve">365 ms</w:t>
+            </w:r>
+          </w:p>
+        </w:tc>
+        <w:tc>
+          <w:tcPr>
+            <w:tcW w:type="dxa" w:w="1271"/>
+            <w:tcBorders>
+              <w:top w:val="single" w:color="BFC9D6" w:sz="4"/>
+              <w:left w:val="single" w:color="BFC9D6" w:sz="4"/>
+              <w:bottom w:val="single" w:color="BFC9D6" w:sz="4"/>
+              <w:right w:val="single" w:color="BFC9D6" w:sz="4"/>
+            </w:tcBorders>
+            <w:tcMar>
+              <w:top w:type="dxa" w:w="50"/>
+              <w:left w:type="dxa" w:w="90"/>
+              <w:bottom w:type="dxa" w:w="50"/>
+              <w:right w:type="dxa" w:w="90"/>
+            </w:tcMar>
+            <w:vAlign w:val="top"/>
+          </w:tcPr>
+          <w:p>
+            <w:pPr>
+              <w:keepNext w:val="false"/>
+              <w:bidi/>
+              <w:spacing w:after="30" w:before="30" w:line="264"/>
+            </w:pPr>
+            <w:r>
+              <w:rPr>
+                <w:rFonts w:ascii="Arial" w:cs="Arial" w:eastAsia="Arial" w:hAnsi="Arial"/>
+                <w:b w:val="false"/>
+                <w:bCs w:val="false"/>
+                <w:sz w:val="18"/>
+                <w:szCs w:val="18"/>
+                <w:rtl/>
+              </w:rPr>
+              <w:t xml:space="preserve">2,634 ms</w:t>
+            </w:r>
+          </w:p>
+        </w:tc>
+      </w:tr>
+      <w:tr>
+        <w:trPr>
+          <w:cantSplit/>
+        </w:trPr>
+        <w:tc>
+          <w:tcPr>
+            <w:tcW w:type="dxa" w:w="6568"/>
+            <w:tcBorders>
+              <w:top w:val="single" w:color="BFC9D6" w:sz="4"/>
+              <w:left w:val="single" w:color="BFC9D6" w:sz="4"/>
+              <w:bottom w:val="single" w:color="BFC9D6" w:sz="4"/>
+              <w:right w:val="single" w:color="BFC9D6" w:sz="4"/>
+            </w:tcBorders>
+            <w:shd w:fill="F5F8FC" w:color="auto" w:val="clear"/>
+            <w:tcMar>
+              <w:top w:type="dxa" w:w="50"/>
+              <w:left w:type="dxa" w:w="90"/>
+              <w:bottom w:type="dxa" w:w="50"/>
+              <w:right w:type="dxa" w:w="90"/>
+            </w:tcMar>
+            <w:vAlign w:val="top"/>
+          </w:tcPr>
+          <w:p>
+            <w:pPr>
+              <w:keepNext w:val="false"/>
+              <w:bidi/>
+              <w:spacing w:after="30" w:before="30" w:line="264"/>
+            </w:pPr>
+            <w:r>
+              <w:rPr>
+                <w:rFonts w:ascii="Courier New" w:cs="Courier New" w:eastAsia="Courier New" w:hAnsi="Courier New"/>
+                <w:b w:val="false"/>
+                <w:bCs w:val="false"/>
+                <w:color w:val="1F2937"/>
+                <w:sz w:val="16"/>
+                <w:szCs w:val="16"/>
+                <w:shd w:fill="F1F3F5" w:color="auto" w:val="clear"/>
+                <w:rtl/>
+              </w:rPr>
+              <w:t xml:space="preserve">‎/facilities/{id}/limits‎</w:t>
+            </w:r>
+          </w:p>
+        </w:tc>
+        <w:tc>
+          <w:tcPr>
+            <w:tcW w:type="dxa" w:w="966"/>
+            <w:tcBorders>
+              <w:top w:val="single" w:color="BFC9D6" w:sz="4"/>
+              <w:left w:val="single" w:color="BFC9D6" w:sz="4"/>
+              <w:bottom w:val="single" w:color="BFC9D6" w:sz="4"/>
+              <w:right w:val="single" w:color="BFC9D6" w:sz="4"/>
+            </w:tcBorders>
+            <w:shd w:fill="F5F8FC" w:color="auto" w:val="clear"/>
+            <w:tcMar>
+              <w:top w:type="dxa" w:w="50"/>
+              <w:left w:type="dxa" w:w="90"/>
+              <w:bottom w:type="dxa" w:w="50"/>
+              <w:right w:type="dxa" w:w="90"/>
+            </w:tcMar>
+            <w:vAlign w:val="top"/>
+          </w:tcPr>
+          <w:p>
+            <w:pPr>
+              <w:keepNext w:val="false"/>
+              <w:bidi/>
+              <w:spacing w:after="30" w:before="30" w:line="264"/>
+            </w:pPr>
+            <w:r>
+              <w:rPr>
+                <w:rFonts w:ascii="Arial" w:cs="Arial" w:eastAsia="Arial" w:hAnsi="Arial"/>
+                <w:b w:val="false"/>
+                <w:bCs w:val="false"/>
+                <w:sz w:val="18"/>
+                <w:szCs w:val="18"/>
+                <w:rtl/>
+              </w:rPr>
+              <w:t xml:space="preserve">143 ms</w:t>
+            </w:r>
+          </w:p>
+        </w:tc>
+        <w:tc>
+          <w:tcPr>
+            <w:tcW w:type="dxa" w:w="1059"/>
+            <w:tcBorders>
+              <w:top w:val="single" w:color="BFC9D6" w:sz="4"/>
+              <w:left w:val="single" w:color="BFC9D6" w:sz="4"/>
+              <w:bottom w:val="single" w:color="BFC9D6" w:sz="4"/>
+              <w:right w:val="single" w:color="BFC9D6" w:sz="4"/>
+            </w:tcBorders>
+            <w:shd w:fill="F5F8FC" w:color="auto" w:val="clear"/>
+            <w:tcMar>
+              <w:top w:type="dxa" w:w="50"/>
+              <w:left w:type="dxa" w:w="90"/>
+              <w:bottom w:type="dxa" w:w="50"/>
+              <w:right w:type="dxa" w:w="90"/>
+            </w:tcMar>
+            <w:vAlign w:val="top"/>
+          </w:tcPr>
+          <w:p>
+            <w:pPr>
+              <w:keepNext w:val="false"/>
+              <w:bidi/>
+              <w:spacing w:after="30" w:before="30" w:line="264"/>
+            </w:pPr>
+            <w:r>
+              <w:rPr>
+                <w:rFonts w:ascii="Arial" w:cs="Arial" w:eastAsia="Arial" w:hAnsi="Arial"/>
+                <w:b w:val="false"/>
+                <w:bCs w:val="false"/>
+                <w:sz w:val="18"/>
+                <w:szCs w:val="18"/>
+                <w:rtl/>
+              </w:rPr>
+              <w:t xml:space="preserve">230 ms</w:t>
+            </w:r>
+          </w:p>
+        </w:tc>
+        <w:tc>
+          <w:tcPr>
+            <w:tcW w:type="dxa" w:w="1271"/>
+            <w:tcBorders>
+              <w:top w:val="single" w:color="BFC9D6" w:sz="4"/>
+              <w:left w:val="single" w:color="BFC9D6" w:sz="4"/>
+              <w:bottom w:val="single" w:color="BFC9D6" w:sz="4"/>
+              <w:right w:val="single" w:color="BFC9D6" w:sz="4"/>
+            </w:tcBorders>
+            <w:shd w:fill="F5F8FC" w:color="auto" w:val="clear"/>
+            <w:tcMar>
+              <w:top w:type="dxa" w:w="50"/>
+              <w:left w:type="dxa" w:w="90"/>
+              <w:bottom w:type="dxa" w:w="50"/>
+              <w:right w:type="dxa" w:w="90"/>
+            </w:tcMar>
+            <w:vAlign w:val="top"/>
+          </w:tcPr>
+          <w:p>
+            <w:pPr>
+              <w:keepNext w:val="false"/>
+              <w:bidi/>
+              <w:spacing w:after="30" w:before="30" w:line="264"/>
+            </w:pPr>
+            <w:r>
+              <w:rPr>
+                <w:rFonts w:ascii="Arial" w:cs="Arial" w:eastAsia="Arial" w:hAnsi="Arial"/>
+                <w:b w:val="false"/>
+                <w:bCs w:val="false"/>
+                <w:sz w:val="18"/>
+                <w:szCs w:val="18"/>
+                <w:rtl/>
+              </w:rPr>
+              <w:t xml:space="preserve">2,313 ms</w:t>
+            </w:r>
+          </w:p>
+        </w:tc>
+      </w:tr>
+      <w:tr>
+        <w:trPr>
+          <w:cantSplit/>
+        </w:trPr>
+        <w:tc>
+          <w:tcPr>
+            <w:tcW w:type="dxa" w:w="6568"/>
+            <w:tcBorders>
+              <w:top w:val="single" w:color="BFC9D6" w:sz="4"/>
+              <w:left w:val="single" w:color="BFC9D6" w:sz="4"/>
+              <w:bottom w:val="single" w:color="BFC9D6" w:sz="4"/>
+              <w:right w:val="single" w:color="BFC9D6" w:sz="4"/>
+            </w:tcBorders>
+            <w:tcMar>
+              <w:top w:type="dxa" w:w="50"/>
+              <w:left w:type="dxa" w:w="90"/>
+              <w:bottom w:type="dxa" w:w="50"/>
+              <w:right w:type="dxa" w:w="90"/>
+            </w:tcMar>
+            <w:vAlign w:val="top"/>
+          </w:tcPr>
+          <w:p>
+            <w:pPr>
+              <w:keepNext w:val="false"/>
+              <w:bidi/>
+              <w:spacing w:after="30" w:before="30" w:line="264"/>
+            </w:pPr>
+            <w:r>
+              <w:rPr>
+                <w:rFonts w:ascii="Courier New" w:cs="Courier New" w:eastAsia="Courier New" w:hAnsi="Courier New"/>
+                <w:b w:val="false"/>
+                <w:bCs w:val="false"/>
+                <w:color w:val="1F2937"/>
+                <w:sz w:val="16"/>
+                <w:szCs w:val="16"/>
+                <w:shd w:fill="F1F3F5" w:color="auto" w:val="clear"/>
+                <w:rtl/>
+              </w:rPr>
+              <w:t xml:space="preserve">‎/facilities/{id}/compliance‎</w:t>
+            </w:r>
+          </w:p>
+        </w:tc>
+        <w:tc>
+          <w:tcPr>
+            <w:tcW w:type="dxa" w:w="966"/>
+            <w:tcBorders>
+              <w:top w:val="single" w:color="BFC9D6" w:sz="4"/>
+              <w:left w:val="single" w:color="BFC9D6" w:sz="4"/>
+              <w:bottom w:val="single" w:color="BFC9D6" w:sz="4"/>
+              <w:right w:val="single" w:color="BFC9D6" w:sz="4"/>
+            </w:tcBorders>
+            <w:tcMar>
+              <w:top w:type="dxa" w:w="50"/>
+              <w:left w:type="dxa" w:w="90"/>
+              <w:bottom w:type="dxa" w:w="50"/>
+              <w:right w:type="dxa" w:w="90"/>
+            </w:tcMar>
+            <w:vAlign w:val="top"/>
+          </w:tcPr>
+          <w:p>
+            <w:pPr>
+              <w:keepNext w:val="false"/>
+              <w:bidi/>
+              <w:spacing w:after="30" w:before="30" w:line="264"/>
+            </w:pPr>
+            <w:r>
+              <w:rPr>
+                <w:rFonts w:ascii="Arial" w:cs="Arial" w:eastAsia="Arial" w:hAnsi="Arial"/>
+                <w:b w:val="false"/>
+                <w:bCs w:val="false"/>
+                <w:sz w:val="18"/>
+                <w:szCs w:val="18"/>
+                <w:rtl/>
+              </w:rPr>
+              <w:t xml:space="preserve">146 ms</w:t>
+            </w:r>
+          </w:p>
+        </w:tc>
+        <w:tc>
+          <w:tcPr>
+            <w:tcW w:type="dxa" w:w="1059"/>
+            <w:tcBorders>
+              <w:top w:val="single" w:color="BFC9D6" w:sz="4"/>
+              <w:left w:val="single" w:color="BFC9D6" w:sz="4"/>
+              <w:bottom w:val="single" w:color="BFC9D6" w:sz="4"/>
+              <w:right w:val="single" w:color="BFC9D6" w:sz="4"/>
+            </w:tcBorders>
+            <w:tcMar>
+              <w:top w:type="dxa" w:w="50"/>
+              <w:left w:type="dxa" w:w="90"/>
+              <w:bottom w:type="dxa" w:w="50"/>
+              <w:right w:type="dxa" w:w="90"/>
+            </w:tcMar>
+            <w:vAlign w:val="top"/>
+          </w:tcPr>
+          <w:p>
+            <w:pPr>
+              <w:keepNext w:val="false"/>
+              <w:bidi/>
+              <w:spacing w:after="30" w:before="30" w:line="264"/>
+            </w:pPr>
+            <w:r>
+              <w:rPr>
+                <w:rFonts w:ascii="Arial" w:cs="Arial" w:eastAsia="Arial" w:hAnsi="Arial"/>
+                <w:b w:val="false"/>
+                <w:bCs w:val="false"/>
+                <w:sz w:val="18"/>
+                <w:szCs w:val="18"/>
+                <w:rtl/>
+              </w:rPr>
+              <w:t xml:space="preserve">237 ms</w:t>
+            </w:r>
+          </w:p>
+        </w:tc>
+        <w:tc>
+          <w:tcPr>
+            <w:tcW w:type="dxa" w:w="1271"/>
+            <w:tcBorders>
+              <w:top w:val="single" w:color="BFC9D6" w:sz="4"/>
+              <w:left w:val="single" w:color="BFC9D6" w:sz="4"/>
+              <w:bottom w:val="single" w:color="BFC9D6" w:sz="4"/>
+              <w:right w:val="single" w:color="BFC9D6" w:sz="4"/>
+            </w:tcBorders>
+            <w:tcMar>
+              <w:top w:type="dxa" w:w="50"/>
+              <w:left w:type="dxa" w:w="90"/>
+              <w:bottom w:type="dxa" w:w="50"/>
+              <w:right w:type="dxa" w:w="90"/>
+            </w:tcMar>
+            <w:vAlign w:val="top"/>
+          </w:tcPr>
+          <w:p>
+            <w:pPr>
+              <w:keepNext w:val="false"/>
+              <w:bidi/>
+              <w:spacing w:after="30" w:before="30" w:line="264"/>
+            </w:pPr>
+            <w:r>
+              <w:rPr>
+                <w:rFonts w:ascii="Arial" w:cs="Arial" w:eastAsia="Arial" w:hAnsi="Arial"/>
+                <w:b w:val="false"/>
+                <w:bCs w:val="false"/>
+                <w:sz w:val="18"/>
+                <w:szCs w:val="18"/>
+                <w:rtl/>
+              </w:rPr>
+              <w:t xml:space="preserve">2,441 ms</w:t>
+            </w:r>
+          </w:p>
+        </w:tc>
+      </w:tr>
+      <w:tr>
+        <w:trPr>
+          <w:cantSplit/>
+        </w:trPr>
+        <w:tc>
+          <w:tcPr>
+            <w:tcW w:type="dxa" w:w="6568"/>
+            <w:tcBorders>
+              <w:top w:val="single" w:color="BFC9D6" w:sz="4"/>
+              <w:left w:val="single" w:color="BFC9D6" w:sz="4"/>
+              <w:bottom w:val="single" w:color="BFC9D6" w:sz="4"/>
+              <w:right w:val="single" w:color="BFC9D6" w:sz="4"/>
+            </w:tcBorders>
+            <w:shd w:fill="F5F8FC" w:color="auto" w:val="clear"/>
+            <w:tcMar>
+              <w:top w:type="dxa" w:w="50"/>
+              <w:left w:type="dxa" w:w="90"/>
+              <w:bottom w:type="dxa" w:w="50"/>
+              <w:right w:type="dxa" w:w="90"/>
+            </w:tcMar>
+            <w:vAlign w:val="top"/>
+          </w:tcPr>
+          <w:p>
+            <w:pPr>
+              <w:keepNext w:val="false"/>
+              <w:bidi/>
+              <w:spacing w:after="30" w:before="30" w:line="264"/>
+            </w:pPr>
+            <w:r>
+              <w:rPr>
+                <w:rFonts w:ascii="Courier New" w:cs="Courier New" w:eastAsia="Courier New" w:hAnsi="Courier New"/>
+                <w:b w:val="false"/>
+                <w:bCs w:val="false"/>
+                <w:color w:val="1F2937"/>
+                <w:sz w:val="16"/>
+                <w:szCs w:val="16"/>
+                <w:shd w:fill="F1F3F5" w:color="auto" w:val="clear"/>
+                <w:rtl/>
+              </w:rPr>
+              <w:t xml:space="preserve">‎/facilities/{id}/covenant-tests‎</w:t>
+            </w:r>
+          </w:p>
+        </w:tc>
+        <w:tc>
+          <w:tcPr>
+            <w:tcW w:type="dxa" w:w="966"/>
+            <w:tcBorders>
+              <w:top w:val="single" w:color="BFC9D6" w:sz="4"/>
+              <w:left w:val="single" w:color="BFC9D6" w:sz="4"/>
+              <w:bottom w:val="single" w:color="BFC9D6" w:sz="4"/>
+              <w:right w:val="single" w:color="BFC9D6" w:sz="4"/>
+            </w:tcBorders>
+            <w:shd w:fill="F5F8FC" w:color="auto" w:val="clear"/>
+            <w:tcMar>
+              <w:top w:type="dxa" w:w="50"/>
+              <w:left w:type="dxa" w:w="90"/>
+              <w:bottom w:type="dxa" w:w="50"/>
+              <w:right w:type="dxa" w:w="90"/>
+            </w:tcMar>
+            <w:vAlign w:val="top"/>
+          </w:tcPr>
+          <w:p>
+            <w:pPr>
+              <w:keepNext w:val="false"/>
+              <w:bidi/>
+              <w:spacing w:after="30" w:before="30" w:line="264"/>
+            </w:pPr>
+            <w:r>
+              <w:rPr>
+                <w:rFonts w:ascii="Arial" w:cs="Arial" w:eastAsia="Arial" w:hAnsi="Arial"/>
+                <w:b w:val="false"/>
+                <w:bCs w:val="false"/>
+                <w:sz w:val="18"/>
+                <w:szCs w:val="18"/>
+                <w:rtl/>
+              </w:rPr>
+              <w:t xml:space="preserve">126 ms</w:t>
+            </w:r>
+          </w:p>
+        </w:tc>
+        <w:tc>
+          <w:tcPr>
+            <w:tcW w:type="dxa" w:w="1059"/>
+            <w:tcBorders>
+              <w:top w:val="single" w:color="BFC9D6" w:sz="4"/>
+              <w:left w:val="single" w:color="BFC9D6" w:sz="4"/>
+              <w:bottom w:val="single" w:color="BFC9D6" w:sz="4"/>
+              <w:right w:val="single" w:color="BFC9D6" w:sz="4"/>
+            </w:tcBorders>
+            <w:shd w:fill="F5F8FC" w:color="auto" w:val="clear"/>
+            <w:tcMar>
+              <w:top w:type="dxa" w:w="50"/>
+              <w:left w:type="dxa" w:w="90"/>
+              <w:bottom w:type="dxa" w:w="50"/>
+              <w:right w:type="dxa" w:w="90"/>
+            </w:tcMar>
+            <w:vAlign w:val="top"/>
+          </w:tcPr>
+          <w:p>
+            <w:pPr>
+              <w:keepNext w:val="false"/>
+              <w:bidi/>
+              <w:spacing w:after="30" w:before="30" w:line="264"/>
+            </w:pPr>
+            <w:r>
+              <w:rPr>
+                <w:rFonts w:ascii="Arial" w:cs="Arial" w:eastAsia="Arial" w:hAnsi="Arial"/>
+                <w:b w:val="false"/>
+                <w:bCs w:val="false"/>
+                <w:sz w:val="18"/>
+                <w:szCs w:val="18"/>
+                <w:rtl/>
+              </w:rPr>
+              <w:t xml:space="preserve">516 ms</w:t>
+            </w:r>
+          </w:p>
+        </w:tc>
+        <w:tc>
+          <w:tcPr>
+            <w:tcW w:type="dxa" w:w="1271"/>
+            <w:tcBorders>
+              <w:top w:val="single" w:color="BFC9D6" w:sz="4"/>
+              <w:left w:val="single" w:color="BFC9D6" w:sz="4"/>
+              <w:bottom w:val="single" w:color="BFC9D6" w:sz="4"/>
+              <w:right w:val="single" w:color="BFC9D6" w:sz="4"/>
+            </w:tcBorders>
+            <w:shd w:fill="F5F8FC" w:color="auto" w:val="clear"/>
+            <w:tcMar>
+              <w:top w:type="dxa" w:w="50"/>
+              <w:left w:type="dxa" w:w="90"/>
+              <w:bottom w:type="dxa" w:w="50"/>
+              <w:right w:type="dxa" w:w="90"/>
+            </w:tcMar>
+            <w:vAlign w:val="top"/>
+          </w:tcPr>
+          <w:p>
+            <w:pPr>
+              <w:keepNext w:val="false"/>
+              <w:bidi/>
+              <w:spacing w:after="30" w:before="30" w:line="264"/>
+            </w:pPr>
+            <w:r>
+              <w:rPr>
+                <w:rFonts w:ascii="Arial" w:cs="Arial" w:eastAsia="Arial" w:hAnsi="Arial"/>
+                <w:b w:val="false"/>
+                <w:bCs w:val="false"/>
+                <w:sz w:val="18"/>
+                <w:szCs w:val="18"/>
+                <w:rtl/>
+              </w:rPr>
+              <w:t xml:space="preserve">2,425 ms</w:t>
+            </w:r>
+          </w:p>
+        </w:tc>
+      </w:tr>
+      <w:tr>
+        <w:trPr>
+          <w:cantSplit/>
+        </w:trPr>
+        <w:tc>
+          <w:tcPr>
+            <w:tcW w:type="dxa" w:w="6568"/>
+            <w:tcBorders>
+              <w:top w:val="single" w:color="BFC9D6" w:sz="4"/>
+              <w:left w:val="single" w:color="BFC9D6" w:sz="4"/>
+              <w:bottom w:val="single" w:color="BFC9D6" w:sz="4"/>
+              <w:right w:val="single" w:color="BFC9D6" w:sz="4"/>
+            </w:tcBorders>
+            <w:tcMar>
+              <w:top w:type="dxa" w:w="50"/>
+              <w:left w:type="dxa" w:w="90"/>
+              <w:bottom w:type="dxa" w:w="50"/>
+              <w:right w:type="dxa" w:w="90"/>
+            </w:tcMar>
+            <w:vAlign w:val="top"/>
+          </w:tcPr>
+          <w:p>
+            <w:pPr>
+              <w:keepNext w:val="false"/>
+              <w:bidi/>
+              <w:spacing w:after="30" w:before="30" w:line="264"/>
+            </w:pPr>
+            <w:r>
+              <w:rPr>
+                <w:rFonts w:ascii="Courier New" w:cs="Courier New" w:eastAsia="Courier New" w:hAnsi="Courier New"/>
+                <w:b w:val="false"/>
+                <w:bCs w:val="false"/>
+                <w:color w:val="1F2937"/>
+                <w:sz w:val="16"/>
+                <w:szCs w:val="16"/>
+                <w:shd w:fill="F1F3F5" w:color="auto" w:val="clear"/>
+                <w:rtl/>
+              </w:rPr>
+              <w:t xml:space="preserve">‎/financial-statements‎</w:t>
+            </w:r>
+          </w:p>
+        </w:tc>
+        <w:tc>
+          <w:tcPr>
+            <w:tcW w:type="dxa" w:w="966"/>
+            <w:tcBorders>
+              <w:top w:val="single" w:color="BFC9D6" w:sz="4"/>
+              <w:left w:val="single" w:color="BFC9D6" w:sz="4"/>
+              <w:bottom w:val="single" w:color="BFC9D6" w:sz="4"/>
+              <w:right w:val="single" w:color="BFC9D6" w:sz="4"/>
+            </w:tcBorders>
+            <w:tcMar>
+              <w:top w:type="dxa" w:w="50"/>
+              <w:left w:type="dxa" w:w="90"/>
+              <w:bottom w:type="dxa" w:w="50"/>
+              <w:right w:type="dxa" w:w="90"/>
+            </w:tcMar>
+            <w:vAlign w:val="top"/>
+          </w:tcPr>
+          <w:p>
+            <w:pPr>
+              <w:keepNext w:val="false"/>
+              <w:bidi/>
+              <w:spacing w:after="30" w:before="30" w:line="264"/>
+            </w:pPr>
+            <w:r>
+              <w:rPr>
+                <w:rFonts w:ascii="Arial" w:cs="Arial" w:eastAsia="Arial" w:hAnsi="Arial"/>
+                <w:b w:val="false"/>
+                <w:bCs w:val="false"/>
+                <w:sz w:val="18"/>
+                <w:szCs w:val="18"/>
+                <w:rtl/>
+              </w:rPr>
+              <w:t xml:space="preserve">109 ms</w:t>
+            </w:r>
+          </w:p>
+        </w:tc>
+        <w:tc>
+          <w:tcPr>
+            <w:tcW w:type="dxa" w:w="1059"/>
+            <w:tcBorders>
+              <w:top w:val="single" w:color="BFC9D6" w:sz="4"/>
+              <w:left w:val="single" w:color="BFC9D6" w:sz="4"/>
+              <w:bottom w:val="single" w:color="BFC9D6" w:sz="4"/>
+              <w:right w:val="single" w:color="BFC9D6" w:sz="4"/>
+            </w:tcBorders>
+            <w:tcMar>
+              <w:top w:type="dxa" w:w="50"/>
+              <w:left w:type="dxa" w:w="90"/>
+              <w:bottom w:type="dxa" w:w="50"/>
+              <w:right w:type="dxa" w:w="90"/>
+            </w:tcMar>
+            <w:vAlign w:val="top"/>
+          </w:tcPr>
+          <w:p>
+            <w:pPr>
+              <w:keepNext w:val="false"/>
+              <w:bidi/>
+              <w:spacing w:after="30" w:before="30" w:line="264"/>
+            </w:pPr>
+            <w:r>
+              <w:rPr>
+                <w:rFonts w:ascii="Arial" w:cs="Arial" w:eastAsia="Arial" w:hAnsi="Arial"/>
+                <w:b w:val="false"/>
+                <w:bCs w:val="false"/>
+                <w:sz w:val="18"/>
+                <w:szCs w:val="18"/>
+                <w:rtl/>
+              </w:rPr>
+              <w:t xml:space="preserve">354 ms</w:t>
+            </w:r>
+          </w:p>
+        </w:tc>
+        <w:tc>
+          <w:tcPr>
+            <w:tcW w:type="dxa" w:w="1271"/>
+            <w:tcBorders>
+              <w:top w:val="single" w:color="BFC9D6" w:sz="4"/>
+              <w:left w:val="single" w:color="BFC9D6" w:sz="4"/>
+              <w:bottom w:val="single" w:color="BFC9D6" w:sz="4"/>
+              <w:right w:val="single" w:color="BFC9D6" w:sz="4"/>
+            </w:tcBorders>
+            <w:tcMar>
+              <w:top w:type="dxa" w:w="50"/>
+              <w:left w:type="dxa" w:w="90"/>
+              <w:bottom w:type="dxa" w:w="50"/>
+              <w:right w:type="dxa" w:w="90"/>
+            </w:tcMar>
+            <w:vAlign w:val="top"/>
+          </w:tcPr>
+          <w:p>
+            <w:pPr>
+              <w:keepNext w:val="false"/>
+              <w:bidi/>
+              <w:spacing w:after="30" w:before="30" w:line="264"/>
+            </w:pPr>
+            <w:r>
+              <w:rPr>
+                <w:rFonts w:ascii="Arial" w:cs="Arial" w:eastAsia="Arial" w:hAnsi="Arial"/>
+                <w:b w:val="false"/>
+                <w:bCs w:val="false"/>
+                <w:sz w:val="18"/>
+                <w:szCs w:val="18"/>
+                <w:rtl/>
+              </w:rPr>
+              <w:t xml:space="preserve">2,061 ms</w:t>
+            </w:r>
+          </w:p>
+        </w:tc>
+      </w:tr>
+      <w:tr>
+        <w:trPr>
+          <w:cantSplit/>
+        </w:trPr>
+        <w:tc>
+          <w:tcPr>
+            <w:tcW w:type="dxa" w:w="6568"/>
+            <w:tcBorders>
+              <w:top w:val="single" w:color="BFC9D6" w:sz="4"/>
+              <w:left w:val="single" w:color="BFC9D6" w:sz="4"/>
+              <w:bottom w:val="single" w:color="BFC9D6" w:sz="4"/>
+              <w:right w:val="single" w:color="BFC9D6" w:sz="4"/>
+            </w:tcBorders>
+            <w:shd w:fill="F5F8FC" w:color="auto" w:val="clear"/>
+            <w:tcMar>
+              <w:top w:type="dxa" w:w="50"/>
+              <w:left w:type="dxa" w:w="90"/>
+              <w:bottom w:type="dxa" w:w="50"/>
+              <w:right w:type="dxa" w:w="90"/>
+            </w:tcMar>
+            <w:vAlign w:val="top"/>
+          </w:tcPr>
+          <w:p>
+            <w:pPr>
+              <w:keepNext w:val="false"/>
+              <w:bidi/>
+              <w:spacing w:after="30" w:before="30" w:line="264"/>
+            </w:pPr>
+            <w:r>
+              <w:rPr>
+                <w:rFonts w:ascii="Courier New" w:cs="Courier New" w:eastAsia="Courier New" w:hAnsi="Courier New"/>
+                <w:b w:val="false"/>
+                <w:bCs w:val="false"/>
+                <w:color w:val="1F2937"/>
+                <w:sz w:val="16"/>
+                <w:szCs w:val="16"/>
+                <w:shd w:fill="F1F3F5" w:color="auto" w:val="clear"/>
+                <w:rtl/>
+              </w:rPr>
+              <w:t xml:space="preserve">‎/financial-statements/{id}‎</w:t>
+            </w:r>
+          </w:p>
+        </w:tc>
+        <w:tc>
+          <w:tcPr>
+            <w:tcW w:type="dxa" w:w="966"/>
+            <w:tcBorders>
+              <w:top w:val="single" w:color="BFC9D6" w:sz="4"/>
+              <w:left w:val="single" w:color="BFC9D6" w:sz="4"/>
+              <w:bottom w:val="single" w:color="BFC9D6" w:sz="4"/>
+              <w:right w:val="single" w:color="BFC9D6" w:sz="4"/>
+            </w:tcBorders>
+            <w:shd w:fill="F5F8FC" w:color="auto" w:val="clear"/>
+            <w:tcMar>
+              <w:top w:type="dxa" w:w="50"/>
+              <w:left w:type="dxa" w:w="90"/>
+              <w:bottom w:type="dxa" w:w="50"/>
+              <w:right w:type="dxa" w:w="90"/>
+            </w:tcMar>
+            <w:vAlign w:val="top"/>
+          </w:tcPr>
+          <w:p>
+            <w:pPr>
+              <w:keepNext w:val="false"/>
+              <w:bidi/>
+              <w:spacing w:after="30" w:before="30" w:line="264"/>
+            </w:pPr>
+            <w:r>
+              <w:rPr>
+                <w:rFonts w:ascii="Arial" w:cs="Arial" w:eastAsia="Arial" w:hAnsi="Arial"/>
+                <w:b w:val="false"/>
+                <w:bCs w:val="false"/>
+                <w:sz w:val="18"/>
+                <w:szCs w:val="18"/>
+                <w:rtl/>
+              </w:rPr>
+              <w:t xml:space="preserve">125 ms</w:t>
+            </w:r>
+          </w:p>
+        </w:tc>
+        <w:tc>
+          <w:tcPr>
+            <w:tcW w:type="dxa" w:w="1059"/>
+            <w:tcBorders>
+              <w:top w:val="single" w:color="BFC9D6" w:sz="4"/>
+              <w:left w:val="single" w:color="BFC9D6" w:sz="4"/>
+              <w:bottom w:val="single" w:color="BFC9D6" w:sz="4"/>
+              <w:right w:val="single" w:color="BFC9D6" w:sz="4"/>
+            </w:tcBorders>
+            <w:shd w:fill="F5F8FC" w:color="auto" w:val="clear"/>
+            <w:tcMar>
+              <w:top w:type="dxa" w:w="50"/>
+              <w:left w:type="dxa" w:w="90"/>
+              <w:bottom w:type="dxa" w:w="50"/>
+              <w:right w:type="dxa" w:w="90"/>
+            </w:tcMar>
+            <w:vAlign w:val="top"/>
+          </w:tcPr>
+          <w:p>
+            <w:pPr>
+              <w:keepNext w:val="false"/>
+              <w:bidi/>
+              <w:spacing w:after="30" w:before="30" w:line="264"/>
+            </w:pPr>
+            <w:r>
+              <w:rPr>
+                <w:rFonts w:ascii="Arial" w:cs="Arial" w:eastAsia="Arial" w:hAnsi="Arial"/>
+                <w:b w:val="false"/>
+                <w:bCs w:val="false"/>
+                <w:sz w:val="18"/>
+                <w:szCs w:val="18"/>
+                <w:rtl/>
+              </w:rPr>
+              <w:t xml:space="preserve">401 ms</w:t>
+            </w:r>
+          </w:p>
+        </w:tc>
+        <w:tc>
+          <w:tcPr>
+            <w:tcW w:type="dxa" w:w="1271"/>
+            <w:tcBorders>
+              <w:top w:val="single" w:color="BFC9D6" w:sz="4"/>
+              <w:left w:val="single" w:color="BFC9D6" w:sz="4"/>
+              <w:bottom w:val="single" w:color="BFC9D6" w:sz="4"/>
+              <w:right w:val="single" w:color="BFC9D6" w:sz="4"/>
+            </w:tcBorders>
+            <w:shd w:fill="F5F8FC" w:color="auto" w:val="clear"/>
+            <w:tcMar>
+              <w:top w:type="dxa" w:w="50"/>
+              <w:left w:type="dxa" w:w="90"/>
+              <w:bottom w:type="dxa" w:w="50"/>
+              <w:right w:type="dxa" w:w="90"/>
+            </w:tcMar>
+            <w:vAlign w:val="top"/>
+          </w:tcPr>
+          <w:p>
+            <w:pPr>
+              <w:keepNext w:val="false"/>
+              <w:bidi/>
+              <w:spacing w:after="30" w:before="30" w:line="264"/>
+            </w:pPr>
+            <w:r>
+              <w:rPr>
+                <w:rFonts w:ascii="Arial" w:cs="Arial" w:eastAsia="Arial" w:hAnsi="Arial"/>
+                <w:b w:val="false"/>
+                <w:bCs w:val="false"/>
+                <w:sz w:val="18"/>
+                <w:szCs w:val="18"/>
+                <w:rtl/>
+              </w:rPr>
+              <w:t xml:space="preserve">1,915 ms</w:t>
+            </w:r>
+          </w:p>
+        </w:tc>
+      </w:tr>
+      <w:tr>
+        <w:trPr>
+          <w:cantSplit/>
+        </w:trPr>
+        <w:tc>
+          <w:tcPr>
+            <w:tcW w:type="dxa" w:w="6568"/>
+            <w:tcBorders>
+              <w:top w:val="single" w:color="BFC9D6" w:sz="4"/>
+              <w:left w:val="single" w:color="BFC9D6" w:sz="4"/>
+              <w:bottom w:val="single" w:color="BFC9D6" w:sz="4"/>
+              <w:right w:val="single" w:color="BFC9D6" w:sz="4"/>
+            </w:tcBorders>
+            <w:tcMar>
+              <w:top w:type="dxa" w:w="50"/>
+              <w:left w:type="dxa" w:w="90"/>
+              <w:bottom w:type="dxa" w:w="50"/>
+              <w:right w:type="dxa" w:w="90"/>
+            </w:tcMar>
+            <w:vAlign w:val="top"/>
+          </w:tcPr>
+          <w:p>
+            <w:pPr>
+              <w:keepNext w:val="false"/>
+              <w:bidi/>
+              <w:spacing w:after="30" w:before="30" w:line="264"/>
+            </w:pPr>
+            <w:r>
+              <w:rPr>
+                <w:rFonts w:ascii="Courier New" w:cs="Courier New" w:eastAsia="Courier New" w:hAnsi="Courier New"/>
+                <w:b w:val="false"/>
+                <w:bCs w:val="false"/>
+                <w:color w:val="1F2937"/>
+                <w:sz w:val="16"/>
+                <w:szCs w:val="16"/>
+                <w:shd w:fill="F1F3F5" w:color="auto" w:val="clear"/>
+                <w:rtl/>
+              </w:rPr>
+              <w:t xml:space="preserve">‎/fin/assessments‎</w:t>
+            </w:r>
+          </w:p>
+        </w:tc>
+        <w:tc>
+          <w:tcPr>
+            <w:tcW w:type="dxa" w:w="966"/>
+            <w:tcBorders>
+              <w:top w:val="single" w:color="BFC9D6" w:sz="4"/>
+              <w:left w:val="single" w:color="BFC9D6" w:sz="4"/>
+              <w:bottom w:val="single" w:color="BFC9D6" w:sz="4"/>
+              <w:right w:val="single" w:color="BFC9D6" w:sz="4"/>
+            </w:tcBorders>
+            <w:tcMar>
+              <w:top w:type="dxa" w:w="50"/>
+              <w:left w:type="dxa" w:w="90"/>
+              <w:bottom w:type="dxa" w:w="50"/>
+              <w:right w:type="dxa" w:w="90"/>
+            </w:tcMar>
+            <w:vAlign w:val="top"/>
+          </w:tcPr>
+          <w:p>
+            <w:pPr>
+              <w:keepNext w:val="false"/>
+              <w:bidi/>
+              <w:spacing w:after="30" w:before="30" w:line="264"/>
+            </w:pPr>
+            <w:r>
+              <w:rPr>
+                <w:rFonts w:ascii="Arial" w:cs="Arial" w:eastAsia="Arial" w:hAnsi="Arial"/>
+                <w:b w:val="false"/>
+                <w:bCs w:val="false"/>
+                <w:sz w:val="18"/>
+                <w:szCs w:val="18"/>
+                <w:rtl/>
+              </w:rPr>
+              <w:t xml:space="preserve">122 ms</w:t>
+            </w:r>
+          </w:p>
+        </w:tc>
+        <w:tc>
+          <w:tcPr>
+            <w:tcW w:type="dxa" w:w="1059"/>
+            <w:tcBorders>
+              <w:top w:val="single" w:color="BFC9D6" w:sz="4"/>
+              <w:left w:val="single" w:color="BFC9D6" w:sz="4"/>
+              <w:bottom w:val="single" w:color="BFC9D6" w:sz="4"/>
+              <w:right w:val="single" w:color="BFC9D6" w:sz="4"/>
+            </w:tcBorders>
+            <w:tcMar>
+              <w:top w:type="dxa" w:w="50"/>
+              <w:left w:type="dxa" w:w="90"/>
+              <w:bottom w:type="dxa" w:w="50"/>
+              <w:right w:type="dxa" w:w="90"/>
+            </w:tcMar>
+            <w:vAlign w:val="top"/>
+          </w:tcPr>
+          <w:p>
+            <w:pPr>
+              <w:keepNext w:val="false"/>
+              <w:bidi/>
+              <w:spacing w:after="30" w:before="30" w:line="264"/>
+            </w:pPr>
+            <w:r>
+              <w:rPr>
+                <w:rFonts w:ascii="Arial" w:cs="Arial" w:eastAsia="Arial" w:hAnsi="Arial"/>
+                <w:b w:val="false"/>
+                <w:bCs w:val="false"/>
+                <w:sz w:val="18"/>
+                <w:szCs w:val="18"/>
+                <w:rtl/>
+              </w:rPr>
+              <w:t xml:space="preserve">356 ms</w:t>
+            </w:r>
+          </w:p>
+        </w:tc>
+        <w:tc>
+          <w:tcPr>
+            <w:tcW w:type="dxa" w:w="1271"/>
+            <w:tcBorders>
+              <w:top w:val="single" w:color="BFC9D6" w:sz="4"/>
+              <w:left w:val="single" w:color="BFC9D6" w:sz="4"/>
+              <w:bottom w:val="single" w:color="BFC9D6" w:sz="4"/>
+              <w:right w:val="single" w:color="BFC9D6" w:sz="4"/>
+            </w:tcBorders>
+            <w:tcMar>
+              <w:top w:type="dxa" w:w="50"/>
+              <w:left w:type="dxa" w:w="90"/>
+              <w:bottom w:type="dxa" w:w="50"/>
+              <w:right w:type="dxa" w:w="90"/>
+            </w:tcMar>
+            <w:vAlign w:val="top"/>
+          </w:tcPr>
+          <w:p>
+            <w:pPr>
+              <w:keepNext w:val="false"/>
+              <w:bidi/>
+              <w:spacing w:after="30" w:before="30" w:line="264"/>
+            </w:pPr>
+            <w:r>
+              <w:rPr>
+                <w:rFonts w:ascii="Arial" w:cs="Arial" w:eastAsia="Arial" w:hAnsi="Arial"/>
+                <w:b w:val="false"/>
+                <w:bCs w:val="false"/>
+                <w:sz w:val="18"/>
+                <w:szCs w:val="18"/>
+                <w:rtl/>
+              </w:rPr>
+              <w:t xml:space="preserve">2,238 ms</w:t>
+            </w:r>
+          </w:p>
+        </w:tc>
+      </w:tr>
+      <w:tr>
+        <w:trPr>
+          <w:cantSplit/>
+        </w:trPr>
+        <w:tc>
+          <w:tcPr>
+            <w:tcW w:type="dxa" w:w="6568"/>
+            <w:tcBorders>
+              <w:top w:val="single" w:color="BFC9D6" w:sz="4"/>
+              <w:left w:val="single" w:color="BFC9D6" w:sz="4"/>
+              <w:bottom w:val="single" w:color="BFC9D6" w:sz="4"/>
+              <w:right w:val="single" w:color="BFC9D6" w:sz="4"/>
+            </w:tcBorders>
+            <w:shd w:fill="F5F8FC" w:color="auto" w:val="clear"/>
+            <w:tcMar>
+              <w:top w:type="dxa" w:w="50"/>
+              <w:left w:type="dxa" w:w="90"/>
+              <w:bottom w:type="dxa" w:w="50"/>
+              <w:right w:type="dxa" w:w="90"/>
+            </w:tcMar>
+            <w:vAlign w:val="top"/>
+          </w:tcPr>
+          <w:p>
+            <w:pPr>
+              <w:keepNext w:val="false"/>
+              <w:bidi/>
+              <w:spacing w:after="30" w:before="30" w:line="264"/>
+            </w:pPr>
+            <w:r>
+              <w:rPr>
+                <w:rFonts w:ascii="Courier New" w:cs="Courier New" w:eastAsia="Courier New" w:hAnsi="Courier New"/>
+                <w:b w:val="false"/>
+                <w:bCs w:val="false"/>
+                <w:color w:val="1F2937"/>
+                <w:sz w:val="16"/>
+                <w:szCs w:val="16"/>
+                <w:shd w:fill="F1F3F5" w:color="auto" w:val="clear"/>
+                <w:rtl/>
+              </w:rPr>
+              <w:t xml:space="preserve">‎/reports/compliance‎</w:t>
+            </w:r>
+          </w:p>
+        </w:tc>
+        <w:tc>
+          <w:tcPr>
+            <w:tcW w:type="dxa" w:w="966"/>
+            <w:tcBorders>
+              <w:top w:val="single" w:color="BFC9D6" w:sz="4"/>
+              <w:left w:val="single" w:color="BFC9D6" w:sz="4"/>
+              <w:bottom w:val="single" w:color="BFC9D6" w:sz="4"/>
+              <w:right w:val="single" w:color="BFC9D6" w:sz="4"/>
+            </w:tcBorders>
+            <w:shd w:fill="F5F8FC" w:color="auto" w:val="clear"/>
+            <w:tcMar>
+              <w:top w:type="dxa" w:w="50"/>
+              <w:left w:type="dxa" w:w="90"/>
+              <w:bottom w:type="dxa" w:w="50"/>
+              <w:right w:type="dxa" w:w="90"/>
+            </w:tcMar>
+            <w:vAlign w:val="top"/>
+          </w:tcPr>
+          <w:p>
+            <w:pPr>
+              <w:keepNext w:val="false"/>
+              <w:bidi/>
+              <w:spacing w:after="30" w:before="30" w:line="264"/>
+            </w:pPr>
+            <w:r>
+              <w:rPr>
+                <w:rFonts w:ascii="Arial" w:cs="Arial" w:eastAsia="Arial" w:hAnsi="Arial"/>
+                <w:b w:val="false"/>
+                <w:bCs w:val="false"/>
+                <w:sz w:val="18"/>
+                <w:szCs w:val="18"/>
+                <w:rtl/>
+              </w:rPr>
+              <w:t xml:space="preserve">136 ms</w:t>
+            </w:r>
+          </w:p>
+        </w:tc>
+        <w:tc>
+          <w:tcPr>
+            <w:tcW w:type="dxa" w:w="1059"/>
+            <w:tcBorders>
+              <w:top w:val="single" w:color="BFC9D6" w:sz="4"/>
+              <w:left w:val="single" w:color="BFC9D6" w:sz="4"/>
+              <w:bottom w:val="single" w:color="BFC9D6" w:sz="4"/>
+              <w:right w:val="single" w:color="BFC9D6" w:sz="4"/>
+            </w:tcBorders>
+            <w:shd w:fill="F5F8FC" w:color="auto" w:val="clear"/>
+            <w:tcMar>
+              <w:top w:type="dxa" w:w="50"/>
+              <w:left w:type="dxa" w:w="90"/>
+              <w:bottom w:type="dxa" w:w="50"/>
+              <w:right w:type="dxa" w:w="90"/>
+            </w:tcMar>
+            <w:vAlign w:val="top"/>
+          </w:tcPr>
+          <w:p>
+            <w:pPr>
+              <w:keepNext w:val="false"/>
+              <w:bidi/>
+              <w:spacing w:after="30" w:before="30" w:line="264"/>
+            </w:pPr>
+            <w:r>
+              <w:rPr>
+                <w:rFonts w:ascii="Arial" w:cs="Arial" w:eastAsia="Arial" w:hAnsi="Arial"/>
+                <w:b w:val="false"/>
+                <w:bCs w:val="false"/>
+                <w:sz w:val="18"/>
+                <w:szCs w:val="18"/>
+                <w:rtl/>
+              </w:rPr>
+              <w:t xml:space="preserve">1,014 ms</w:t>
+            </w:r>
+          </w:p>
+        </w:tc>
+        <w:tc>
+          <w:tcPr>
+            <w:tcW w:type="dxa" w:w="1271"/>
+            <w:tcBorders>
+              <w:top w:val="single" w:color="BFC9D6" w:sz="4"/>
+              <w:left w:val="single" w:color="BFC9D6" w:sz="4"/>
+              <w:bottom w:val="single" w:color="BFC9D6" w:sz="4"/>
+              <w:right w:val="single" w:color="BFC9D6" w:sz="4"/>
+            </w:tcBorders>
+            <w:shd w:fill="F5F8FC" w:color="auto" w:val="clear"/>
+            <w:tcMar>
+              <w:top w:type="dxa" w:w="50"/>
+              <w:left w:type="dxa" w:w="90"/>
+              <w:bottom w:type="dxa" w:w="50"/>
+              <w:right w:type="dxa" w:w="90"/>
+            </w:tcMar>
+            <w:vAlign w:val="top"/>
+          </w:tcPr>
+          <w:p>
+            <w:pPr>
+              <w:keepNext w:val="false"/>
+              <w:bidi/>
+              <w:spacing w:after="30" w:before="30" w:line="264"/>
+            </w:pPr>
+            <w:r>
+              <w:rPr>
+                <w:rFonts w:ascii="Arial" w:cs="Arial" w:eastAsia="Arial" w:hAnsi="Arial"/>
+                <w:b w:val="false"/>
+                <w:bCs w:val="false"/>
+                <w:sz w:val="18"/>
+                <w:szCs w:val="18"/>
+                <w:rtl/>
+              </w:rPr>
+              <w:t xml:space="preserve">2,260 ms</w:t>
+            </w:r>
+          </w:p>
+        </w:tc>
+      </w:tr>
+    </w:tbl>
+    <w:p>
+      <w:pPr>
+        <w:bidi/>
+        <w:spacing w:after="120" w:before="0"/>
+      </w:pPr>
+    </w:p>
+    <w:p>
+      <w:pPr>
+        <w:bidi/>
+        <w:spacing w:after="110" w:before="0" w:line="312"/>
+      </w:pPr>
+      <w:r>
+        <w:rPr>
+          <w:rFonts w:ascii="Arial" w:cs="Arial" w:eastAsia="Arial" w:hAnsi="Arial"/>
+          <w:b w:val="false"/>
+          <w:bCs w:val="false"/>
+          <w:sz w:val="21"/>
+          <w:szCs w:val="21"/>
+          <w:rtl/>
+        </w:rPr>
+        <w:t xml:space="preserve">كل p95 تحت ثانيتين (NFR-PERF-01). لكن الحد الأقصى تجاوزهما في سبعة مسارات من ثمانية، وهو أول دفعة من الطلبات المتزامنة. فالحد يُقاس على p95 لا على الأقصى، ولا نعدّه دليلًا على أداء الإنتاج.</w:t>
+      </w:r>
+    </w:p>
+    <w:p>
+      <w:pPr>
+        <w:bidi/>
+        <w:spacing w:after="110" w:before="0" w:line="312"/>
+      </w:pPr>
+      <w:r>
+        <w:rPr>
+          <w:rFonts w:ascii="Arial" w:cs="Arial" w:eastAsia="Arial" w:hAnsi="Arial"/>
+          <w:b w:val="false"/>
+          <w:bCs w:val="false"/>
+          <w:sz w:val="21"/>
+          <w:szCs w:val="21"/>
+          <w:rtl/>
+        </w:rPr>
+        <w:t xml:space="preserve">ما بقي مفتوحًا:</w:t>
+      </w:r>
+    </w:p>
+    <w:p>
+      <w:pPr>
+        <w:pStyle w:val="ListParagraph"/>
+        <w:numPr>
+          <w:ilvl w:val="0"/>
+          <w:numId w:val="2"/>
+        </w:numPr>
+        <w:bidi/>
+        <w:spacing w:after="70" w:before="0" w:line="300"/>
+      </w:pPr>
+      <w:r>
+        <w:rPr>
+          <w:rFonts w:ascii="Arial" w:cs="Arial" w:eastAsia="Arial" w:hAnsi="Arial"/>
+          <w:b/>
+          <w:bCs/>
+          <w:sz w:val="21"/>
+          <w:szCs w:val="21"/>
+          <w:rtl/>
+        </w:rPr>
+        <w:t xml:space="preserve">حراسات 062 و063 في </w:t>
+      </w:r>
+      <w:r>
+        <w:rPr>
+          <w:rFonts w:ascii="Courier New" w:cs="Courier New" w:eastAsia="Courier New" w:hAnsi="Courier New"/>
+          <w:b/>
+          <w:bCs/>
+          <w:color w:val="1F2937"/>
+          <w:sz w:val="18"/>
+          <w:szCs w:val="18"/>
+          <w:shd w:fill="F1F3F5" w:color="auto" w:val="clear"/>
+          <w:rtl/>
+        </w:rPr>
+        <w:t xml:space="preserve">‎db/tests‎</w:t>
+      </w:r>
+      <w:r>
+        <w:rPr>
+          <w:rFonts w:ascii="Arial" w:cs="Arial" w:eastAsia="Arial" w:hAnsi="Arial"/>
+          <w:b w:val="false"/>
+          <w:bCs w:val="false"/>
+          <w:sz w:val="21"/>
+          <w:szCs w:val="21"/>
+          <w:rtl/>
+        </w:rPr>
+        <w:t xml:space="preserve"> (§5 بند 2): لم تُضف بعد، وتغطيها اختبارات التطبيق.</w:t>
+      </w:r>
+    </w:p>
+    <w:p>
+      <w:pPr>
+        <w:pStyle w:val="ListParagraph"/>
+        <w:numPr>
+          <w:ilvl w:val="0"/>
+          <w:numId w:val="2"/>
+        </w:numPr>
+        <w:bidi/>
+        <w:spacing w:after="70" w:before="0" w:line="300"/>
+      </w:pPr>
+      <w:r>
+        <w:rPr>
+          <w:rFonts w:ascii="Arial" w:cs="Arial" w:eastAsia="Arial" w:hAnsi="Arial"/>
+          <w:b/>
+          <w:bCs/>
+          <w:sz w:val="21"/>
+          <w:szCs w:val="21"/>
+          <w:rtl/>
+        </w:rPr>
+        <w:t xml:space="preserve">مرجع مستقل لمحرك التعهدات</w:t>
+      </w:r>
+      <w:r>
+        <w:rPr>
+          <w:rFonts w:ascii="Arial" w:cs="Arial" w:eastAsia="Arial" w:hAnsi="Arial"/>
+          <w:b w:val="false"/>
+          <w:bCs w:val="false"/>
+          <w:sz w:val="21"/>
+          <w:szCs w:val="21"/>
+          <w:rtl/>
+        </w:rPr>
+        <w:t xml:space="preserve"> (§5 بند 3): لم يُبنَ بعد.</w:t>
+      </w:r>
+    </w:p>
+    <w:p>
+      <w:pPr>
+        <w:pStyle w:val="ListParagraph"/>
+        <w:numPr>
+          <w:ilvl w:val="0"/>
+          <w:numId w:val="2"/>
+        </w:numPr>
+        <w:bidi/>
+        <w:spacing w:after="70" w:before="0" w:line="300"/>
+      </w:pPr>
+      <w:r>
+        <w:rPr>
+          <w:rFonts w:ascii="Arial" w:cs="Arial" w:eastAsia="Arial" w:hAnsi="Arial"/>
+          <w:b/>
+          <w:bCs/>
+          <w:sz w:val="21"/>
+          <w:szCs w:val="21"/>
+          <w:rtl/>
+        </w:rPr>
+        <w:t xml:space="preserve">AC-FAC-12 عبر HTTP:</w:t>
+      </w:r>
+      <w:r>
+        <w:rPr>
+          <w:rFonts w:ascii="Arial" w:cs="Arial" w:eastAsia="Arial" w:hAnsi="Arial"/>
+          <w:b w:val="false"/>
+          <w:bCs w:val="false"/>
+          <w:sz w:val="21"/>
+          <w:szCs w:val="21"/>
+          <w:rtl/>
+        </w:rPr>
+        <w:t xml:space="preserve"> ينتظر مسار موافقة الخزينة على الطلب، وهو من S3.</w:t>
+      </w:r>
+    </w:p>
+    <w:p>
+      <w:pPr>
+        <w:pStyle w:val="ListParagraph"/>
+        <w:numPr>
+          <w:ilvl w:val="0"/>
+          <w:numId w:val="2"/>
+        </w:numPr>
+        <w:bidi/>
+        <w:spacing w:after="70" w:before="0" w:line="300"/>
+      </w:pPr>
+      <w:r>
+        <w:rPr>
+          <w:rFonts w:ascii="Arial" w:cs="Arial" w:eastAsia="Arial" w:hAnsi="Arial"/>
+          <w:b/>
+          <w:bCs/>
+          <w:sz w:val="21"/>
+          <w:szCs w:val="21"/>
+          <w:rtl/>
+        </w:rPr>
+        <w:t xml:space="preserve">نص إفصاح IFRS 9:</w:t>
+      </w:r>
+      <w:r>
+        <w:rPr>
+          <w:rFonts w:ascii="Arial" w:cs="Arial" w:eastAsia="Arial" w:hAnsi="Arial"/>
+          <w:b w:val="false"/>
+          <w:bCs w:val="false"/>
+          <w:sz w:val="21"/>
+          <w:szCs w:val="21"/>
+          <w:rtl/>
+        </w:rPr>
+        <w:t xml:space="preserve"> لم يُضف بعد إلى وثيقة الجاهزية.</w:t>
+      </w:r>
+    </w:p>
+    <w:p>
+      <w:pPr>
+        <w:pStyle w:val="ListParagraph"/>
+        <w:numPr>
+          <w:ilvl w:val="0"/>
+          <w:numId w:val="2"/>
+        </w:numPr>
+        <w:bidi/>
+        <w:spacing w:after="70" w:before="0" w:line="300"/>
+      </w:pPr>
+      <w:r>
+        <w:rPr>
+          <w:rFonts w:ascii="Arial" w:cs="Arial" w:eastAsia="Arial" w:hAnsi="Arial"/>
+          <w:b/>
+          <w:bCs/>
+          <w:sz w:val="21"/>
+          <w:szCs w:val="21"/>
+          <w:rtl/>
+        </w:rPr>
+        <w:t xml:space="preserve">قرارات المالك:</w:t>
+      </w:r>
+      <w:r>
+        <w:rPr>
+          <w:rFonts w:ascii="Arial" w:cs="Arial" w:eastAsia="Arial" w:hAnsi="Arial"/>
+          <w:b w:val="false"/>
+          <w:bCs w:val="false"/>
+          <w:sz w:val="21"/>
+          <w:szCs w:val="21"/>
+          <w:rtl/>
+        </w:rPr>
+        <w:t xml:space="preserve"> D2 إلى D6 كما في §4.</w:t>
       </w:r>
     </w:p>
     <w:p>
@@ -5761,7 +8260,7 @@
         <w:szCs w:val="17"/>
         <w:rtl/>
       </w:rPr>
-      <w:t xml:space="preserve">BankFas — الرد على المراجعة 9.0</w:t>
+      <w:t xml:space="preserve">BankFas — الرد على المراجعة الخارجية 9.0</w:t>
     </w:r>
   </w:p>
 </w:hdr>

</xml_diff>